<commit_message>
Updated docs July 1st
</commit_message>
<xml_diff>
--- a/d7_part2_of_dart_extras.docx
+++ b/d7_part2_of_dart_extras.docx
@@ -6,16 +6,16 @@
       <w:pPr>
         <w:jc w:val="center"/>
         <w:rPr>
-          <w:sz w:val="36"/>
-          <w:szCs w:val="36"/>
-        </w:rPr>
-      </w:pPr>
-      <w:r>
-        <w:rPr>
-          <w:b/>
-          <w:bCs/>
-          <w:sz w:val="44"/>
-          <w:szCs w:val="44"/>
+          <w:sz w:val="32"/>
+          <w:szCs w:val="32"/>
+        </w:rPr>
+      </w:pPr>
+      <w:r>
+        <w:rPr>
+          <w:b/>
+          <w:bCs/>
+          <w:sz w:val="40"/>
+          <w:szCs w:val="40"/>
         </w:rPr>
         <w:t>INDEX</w:t>
       </w:r>
@@ -24,31 +24,31 @@
       <w:pPr>
         <w:jc w:val="both"/>
         <w:rPr>
-          <w:sz w:val="36"/>
-          <w:szCs w:val="36"/>
-        </w:rPr>
-      </w:pPr>
-    </w:p>
-    <w:p>
-      <w:pPr>
-        <w:jc w:val="both"/>
-        <w:rPr>
-          <w:sz w:val="36"/>
-          <w:szCs w:val="36"/>
-        </w:rPr>
-      </w:pPr>
-    </w:p>
-    <w:p>
-      <w:pPr>
-        <w:rPr>
-          <w:sz w:val="36"/>
-          <w:szCs w:val="36"/>
-        </w:rPr>
-      </w:pPr>
-      <w:r>
-        <w:rPr>
-          <w:sz w:val="36"/>
-          <w:szCs w:val="36"/>
+          <w:sz w:val="32"/>
+          <w:szCs w:val="32"/>
+        </w:rPr>
+      </w:pPr>
+    </w:p>
+    <w:p>
+      <w:pPr>
+        <w:jc w:val="both"/>
+        <w:rPr>
+          <w:sz w:val="32"/>
+          <w:szCs w:val="32"/>
+        </w:rPr>
+      </w:pPr>
+    </w:p>
+    <w:p>
+      <w:pPr>
+        <w:rPr>
+          <w:sz w:val="32"/>
+          <w:szCs w:val="32"/>
+        </w:rPr>
+      </w:pPr>
+      <w:r>
+        <w:rPr>
+          <w:sz w:val="32"/>
+          <w:szCs w:val="32"/>
         </w:rPr>
         <w:br w:type="page"/>
       </w:r>
@@ -59,19 +59,111 @@
         <w:rPr>
           <w:b/>
           <w:bCs/>
-          <w:sz w:val="36"/>
-          <w:szCs w:val="36"/>
-        </w:rPr>
-      </w:pPr>
+          <w:sz w:val="32"/>
+          <w:szCs w:val="32"/>
+        </w:rPr>
+      </w:pPr>
+      <w:r>
+        <w:rPr>
+          <w:b/>
+          <w:bCs/>
+          <w:sz w:val="32"/>
+          <w:szCs w:val="32"/>
+        </w:rPr>
+        <w:lastRenderedPageBreak/>
+        <w:t>@</w:t>
+      </w:r>
       <w:proofErr w:type="gramStart"/>
       <w:r>
         <w:rPr>
           <w:b/>
           <w:bCs/>
-          <w:sz w:val="36"/>
-          <w:szCs w:val="36"/>
-        </w:rPr>
-        <w:lastRenderedPageBreak/>
+          <w:sz w:val="32"/>
+          <w:szCs w:val="32"/>
+        </w:rPr>
+        <w:t>pragma(</w:t>
+      </w:r>
+      <w:proofErr w:type="gramEnd"/>
+      <w:r>
+        <w:rPr>
+          <w:b/>
+          <w:bCs/>
+          <w:sz w:val="32"/>
+          <w:szCs w:val="32"/>
+        </w:rPr>
+        <w:t>) with Top-Level Function:</w:t>
+      </w:r>
+    </w:p>
+    <w:p>
+      <w:pPr>
+        <w:jc w:val="both"/>
+        <w:rPr>
+          <w:sz w:val="32"/>
+          <w:szCs w:val="32"/>
+        </w:rPr>
+      </w:pPr>
+      <w:r>
+        <w:rPr>
+          <w:sz w:val="32"/>
+          <w:szCs w:val="32"/>
+        </w:rPr>
+        <w:t># For more info see f43 flutter local notifications doc</w:t>
+      </w:r>
+    </w:p>
+    <w:p>
+      <w:pPr>
+        <w:jc w:val="both"/>
+        <w:rPr>
+          <w:sz w:val="32"/>
+          <w:szCs w:val="32"/>
+        </w:rPr>
+      </w:pPr>
+    </w:p>
+    <w:p>
+      <w:pPr>
+        <w:jc w:val="center"/>
+        <w:rPr>
+          <w:sz w:val="32"/>
+          <w:szCs w:val="32"/>
+        </w:rPr>
+      </w:pPr>
+      <w:r>
+        <w:rPr>
+          <w:sz w:val="32"/>
+          <w:szCs w:val="32"/>
+        </w:rPr>
+        <w:t>Break</w:t>
+      </w:r>
+    </w:p>
+    <w:p>
+      <w:pPr>
+        <w:jc w:val="both"/>
+        <w:rPr>
+          <w:b/>
+          <w:bCs/>
+          <w:sz w:val="32"/>
+          <w:szCs w:val="32"/>
+        </w:rPr>
+      </w:pPr>
+    </w:p>
+    <w:p>
+      <w:pPr>
+        <w:jc w:val="both"/>
+        <w:rPr>
+          <w:b/>
+          <w:bCs/>
+          <w:sz w:val="32"/>
+          <w:szCs w:val="32"/>
+        </w:rPr>
+      </w:pPr>
+      <w:proofErr w:type="gramStart"/>
+      <w:r>
+        <w:rPr>
+          <w:b/>
+          <w:bCs/>
+          <w:sz w:val="32"/>
+          <w:szCs w:val="32"/>
+        </w:rPr>
         <w:t>.</w:t>
       </w:r>
       <w:proofErr w:type="spellStart"/>
@@ -79,8 +171,8 @@
         <w:rPr>
           <w:b/>
           <w:bCs/>
-          <w:sz w:val="36"/>
-          <w:szCs w:val="36"/>
+          <w:sz w:val="32"/>
+          <w:szCs w:val="32"/>
         </w:rPr>
         <w:t>switchMap</w:t>
       </w:r>
@@ -90,8 +182,8 @@
         <w:rPr>
           <w:b/>
           <w:bCs/>
-          <w:sz w:val="36"/>
-          <w:szCs w:val="36"/>
+          <w:sz w:val="32"/>
+          <w:szCs w:val="32"/>
         </w:rPr>
         <w:t>() method:</w:t>
       </w:r>
@@ -100,14 +192,14 @@
       <w:pPr>
         <w:jc w:val="both"/>
         <w:rPr>
-          <w:sz w:val="36"/>
-          <w:szCs w:val="36"/>
-        </w:rPr>
-      </w:pPr>
-      <w:r>
-        <w:rPr>
-          <w:sz w:val="36"/>
-          <w:szCs w:val="36"/>
+          <w:sz w:val="32"/>
+          <w:szCs w:val="32"/>
+        </w:rPr>
+      </w:pPr>
+      <w:r>
+        <w:rPr>
+          <w:sz w:val="32"/>
+          <w:szCs w:val="32"/>
         </w:rPr>
         <w:t xml:space="preserve"># </w:t>
       </w:r>
@@ -116,8 +208,8 @@
         <w:rPr>
           <w:b/>
           <w:bCs/>
-          <w:sz w:val="36"/>
-          <w:szCs w:val="36"/>
+          <w:sz w:val="32"/>
+          <w:szCs w:val="32"/>
         </w:rPr>
         <w:t>switchMap</w:t>
       </w:r>
@@ -126,59 +218,31 @@
         <w:rPr>
           <w:b/>
           <w:bCs/>
-          <w:sz w:val="36"/>
-          <w:szCs w:val="36"/>
+          <w:sz w:val="32"/>
+          <w:szCs w:val="32"/>
         </w:rPr>
         <w:t xml:space="preserve"> </w:t>
       </w:r>
       <w:r>
         <w:rPr>
-          <w:sz w:val="36"/>
-          <w:szCs w:val="36"/>
-        </w:rPr>
-        <w:t>listens to a stream, and whenever a new value comes, it switches to a new inner stream and cancels the old one.</w:t>
-      </w:r>
-      <w:r>
-        <w:rPr>
-          <w:sz w:val="36"/>
-          <w:szCs w:val="36"/>
-        </w:rPr>
-        <w:t xml:space="preserve"> </w:t>
-      </w:r>
-      <w:r>
-        <w:rPr>
-          <w:sz w:val="36"/>
-          <w:szCs w:val="36"/>
-        </w:rPr>
-        <w:t>Think</w:t>
-      </w:r>
-      <w:r>
-        <w:rPr>
-          <w:sz w:val="36"/>
-          <w:szCs w:val="36"/>
-        </w:rPr>
-        <w:t xml:space="preserve"> of it like</w:t>
-      </w:r>
-      <w:r>
-        <w:rPr>
-          <w:sz w:val="36"/>
-          <w:szCs w:val="36"/>
-        </w:rPr>
-        <w:t xml:space="preserve"> “Only care about the latest thing.”</w:t>
-      </w:r>
-    </w:p>
-    <w:p>
-      <w:pPr>
-        <w:jc w:val="both"/>
-        <w:rPr>
-          <w:sz w:val="36"/>
-          <w:szCs w:val="36"/>
-        </w:rPr>
-      </w:pPr>
-      <w:r>
-        <w:rPr>
-          <w:sz w:val="36"/>
-          <w:szCs w:val="36"/>
+          <w:sz w:val="32"/>
+          <w:szCs w:val="32"/>
+        </w:rPr>
+        <w:t>listens to a stream, and whenever a new value comes, it switches to a new inner stream and cancels the old one. Think of it like “Only care about the latest thing.”</w:t>
+      </w:r>
+    </w:p>
+    <w:p>
+      <w:pPr>
+        <w:jc w:val="both"/>
+        <w:rPr>
+          <w:sz w:val="32"/>
+          <w:szCs w:val="32"/>
+        </w:rPr>
+      </w:pPr>
+      <w:r>
+        <w:rPr>
+          <w:sz w:val="32"/>
+          <w:szCs w:val="32"/>
         </w:rPr>
         <w:t xml:space="preserve"># To get this add </w:t>
       </w:r>
@@ -187,16 +251,16 @@
         <w:rPr>
           <w:b/>
           <w:bCs/>
-          <w:sz w:val="36"/>
-          <w:szCs w:val="36"/>
+          <w:sz w:val="32"/>
+          <w:szCs w:val="32"/>
         </w:rPr>
         <w:t>rxdart</w:t>
       </w:r>
       <w:proofErr w:type="spellEnd"/>
       <w:r>
         <w:rPr>
-          <w:sz w:val="36"/>
-          <w:szCs w:val="36"/>
+          <w:sz w:val="32"/>
+          <w:szCs w:val="32"/>
         </w:rPr>
         <w:t>:</w:t>
       </w:r>
@@ -207,16 +271,18 @@
         <w:rPr>
           <w:b/>
           <w:bCs/>
-          <w:sz w:val="36"/>
-          <w:szCs w:val="36"/>
-        </w:rPr>
-      </w:pPr>
-      <w:r>
-        <w:rPr>
-          <w:b/>
-          <w:bCs/>
-          <w:sz w:val="36"/>
-          <w:szCs w:val="36"/>
+          <w:color w:val="D86DCB" w:themeColor="accent5" w:themeTint="99"/>
+          <w:sz w:val="32"/>
+          <w:szCs w:val="32"/>
+        </w:rPr>
+      </w:pPr>
+      <w:r>
+        <w:rPr>
+          <w:b/>
+          <w:bCs/>
+          <w:color w:val="D86DCB" w:themeColor="accent5" w:themeTint="99"/>
+          <w:sz w:val="32"/>
+          <w:szCs w:val="32"/>
         </w:rPr>
         <w:t>dependencies:</w:t>
       </w:r>
@@ -227,16 +293,18 @@
         <w:rPr>
           <w:b/>
           <w:bCs/>
-          <w:sz w:val="36"/>
-          <w:szCs w:val="36"/>
-        </w:rPr>
-      </w:pPr>
-      <w:r>
-        <w:rPr>
-          <w:b/>
-          <w:bCs/>
-          <w:sz w:val="36"/>
-          <w:szCs w:val="36"/>
+          <w:color w:val="D86DCB" w:themeColor="accent5" w:themeTint="99"/>
+          <w:sz w:val="32"/>
+          <w:szCs w:val="32"/>
+        </w:rPr>
+      </w:pPr>
+      <w:r>
+        <w:rPr>
+          <w:b/>
+          <w:bCs/>
+          <w:color w:val="D86DCB" w:themeColor="accent5" w:themeTint="99"/>
+          <w:sz w:val="32"/>
+          <w:szCs w:val="32"/>
         </w:rPr>
         <w:t xml:space="preserve">  </w:t>
       </w:r>
@@ -245,8 +313,9 @@
         <w:rPr>
           <w:b/>
           <w:bCs/>
-          <w:sz w:val="36"/>
-          <w:szCs w:val="36"/>
+          <w:color w:val="D86DCB" w:themeColor="accent5" w:themeTint="99"/>
+          <w:sz w:val="32"/>
+          <w:szCs w:val="32"/>
         </w:rPr>
         <w:t>rxdart</w:t>
       </w:r>
@@ -255,8 +324,9 @@
         <w:rPr>
           <w:b/>
           <w:bCs/>
-          <w:sz w:val="36"/>
-          <w:szCs w:val="36"/>
+          <w:color w:val="D86DCB" w:themeColor="accent5" w:themeTint="99"/>
+          <w:sz w:val="32"/>
+          <w:szCs w:val="32"/>
         </w:rPr>
         <w:t>: ^0.27.7</w:t>
       </w:r>
@@ -265,23 +335,16 @@
       <w:pPr>
         <w:jc w:val="both"/>
         <w:rPr>
-          <w:sz w:val="36"/>
-          <w:szCs w:val="36"/>
-        </w:rPr>
-      </w:pPr>
-      <w:r>
-        <w:rPr>
-          <w:sz w:val="36"/>
-          <w:szCs w:val="36"/>
-        </w:rPr>
-        <w:t xml:space="preserve"># </w:t>
-      </w:r>
-      <w:r>
-        <w:rPr>
-          <w:sz w:val="36"/>
-          <w:szCs w:val="36"/>
-        </w:rPr>
-        <w:t>Imagine this timeline:</w:t>
+          <w:sz w:val="32"/>
+          <w:szCs w:val="32"/>
+        </w:rPr>
+      </w:pPr>
+      <w:r>
+        <w:rPr>
+          <w:sz w:val="32"/>
+          <w:szCs w:val="32"/>
+        </w:rPr>
+        <w:t># Imagine this timeline:</w:t>
       </w:r>
     </w:p>
     <w:p>
@@ -293,14 +356,14 @@
         </w:numPr>
         <w:jc w:val="both"/>
         <w:rPr>
-          <w:sz w:val="36"/>
-          <w:szCs w:val="36"/>
-        </w:rPr>
-      </w:pPr>
-      <w:r>
-        <w:rPr>
-          <w:sz w:val="36"/>
-          <w:szCs w:val="36"/>
+          <w:sz w:val="32"/>
+          <w:szCs w:val="32"/>
+        </w:rPr>
+      </w:pPr>
+      <w:r>
+        <w:rPr>
+          <w:sz w:val="32"/>
+          <w:szCs w:val="32"/>
         </w:rPr>
         <w:t>User A logs in → listen to A’s profile</w:t>
       </w:r>
@@ -314,14 +377,14 @@
         </w:numPr>
         <w:jc w:val="both"/>
         <w:rPr>
-          <w:sz w:val="36"/>
-          <w:szCs w:val="36"/>
-        </w:rPr>
-      </w:pPr>
-      <w:r>
-        <w:rPr>
-          <w:sz w:val="36"/>
-          <w:szCs w:val="36"/>
+          <w:sz w:val="32"/>
+          <w:szCs w:val="32"/>
+        </w:rPr>
+      </w:pPr>
+      <w:r>
+        <w:rPr>
+          <w:sz w:val="32"/>
+          <w:szCs w:val="32"/>
         </w:rPr>
         <w:t>User logs out → stop listening to A</w:t>
       </w:r>
@@ -335,14 +398,14 @@
         </w:numPr>
         <w:jc w:val="both"/>
         <w:rPr>
-          <w:sz w:val="36"/>
-          <w:szCs w:val="36"/>
-        </w:rPr>
-      </w:pPr>
-      <w:r>
-        <w:rPr>
-          <w:sz w:val="36"/>
-          <w:szCs w:val="36"/>
+          <w:sz w:val="32"/>
+          <w:szCs w:val="32"/>
+        </w:rPr>
+      </w:pPr>
+      <w:r>
+        <w:rPr>
+          <w:sz w:val="32"/>
+          <w:szCs w:val="32"/>
         </w:rPr>
         <w:t>User B logs in → listen to B’s profile</w:t>
       </w:r>
@@ -351,14 +414,14 @@
       <w:pPr>
         <w:jc w:val="both"/>
         <w:rPr>
-          <w:sz w:val="36"/>
-          <w:szCs w:val="36"/>
-        </w:rPr>
-      </w:pPr>
-      <w:r>
-        <w:rPr>
-          <w:sz w:val="36"/>
-          <w:szCs w:val="36"/>
+          <w:sz w:val="32"/>
+          <w:szCs w:val="32"/>
+        </w:rPr>
+      </w:pPr>
+      <w:r>
+        <w:rPr>
+          <w:sz w:val="32"/>
+          <w:szCs w:val="32"/>
         </w:rPr>
         <w:t xml:space="preserve"># </w:t>
       </w:r>
@@ -367,87 +430,45 @@
         <w:rPr>
           <w:b/>
           <w:bCs/>
-          <w:sz w:val="36"/>
-          <w:szCs w:val="36"/>
+          <w:sz w:val="32"/>
+          <w:szCs w:val="32"/>
         </w:rPr>
         <w:t>switchMap</w:t>
       </w:r>
       <w:proofErr w:type="spellEnd"/>
       <w:r>
         <w:rPr>
-          <w:sz w:val="36"/>
-          <w:szCs w:val="36"/>
-        </w:rPr>
-        <w:t xml:space="preserve"> automatically cancels the old stream and switches to the new one.</w:t>
-      </w:r>
-      <w:r>
-        <w:rPr>
-          <w:sz w:val="36"/>
-          <w:szCs w:val="36"/>
+          <w:sz w:val="32"/>
+          <w:szCs w:val="32"/>
+        </w:rPr>
+        <w:t xml:space="preserve"> automatically cancels the old stream and switches to the new one. If we didn’t use</w:t>
+      </w:r>
+      <w:r>
+        <w:rPr>
+          <w:b/>
+          <w:bCs/>
+          <w:sz w:val="32"/>
+          <w:szCs w:val="32"/>
         </w:rPr>
         <w:t xml:space="preserve"> </w:t>
       </w:r>
-      <w:r>
-        <w:rPr>
-          <w:sz w:val="36"/>
-          <w:szCs w:val="36"/>
-        </w:rPr>
-        <w:t xml:space="preserve">If </w:t>
-      </w:r>
-      <w:r>
-        <w:rPr>
-          <w:sz w:val="36"/>
-          <w:szCs w:val="36"/>
-        </w:rPr>
-        <w:t>we</w:t>
-      </w:r>
-      <w:r>
-        <w:rPr>
-          <w:sz w:val="36"/>
-          <w:szCs w:val="36"/>
-        </w:rPr>
-        <w:t xml:space="preserve"> didn’t use</w:t>
-      </w:r>
-      <w:r>
-        <w:rPr>
-          <w:b/>
-          <w:bCs/>
-          <w:sz w:val="36"/>
-          <w:szCs w:val="36"/>
-        </w:rPr>
-        <w:t xml:space="preserve"> </w:t>
-      </w:r>
       <w:proofErr w:type="spellStart"/>
       <w:r>
         <w:rPr>
           <w:b/>
           <w:bCs/>
-          <w:sz w:val="36"/>
-          <w:szCs w:val="36"/>
+          <w:sz w:val="32"/>
+          <w:szCs w:val="32"/>
         </w:rPr>
         <w:t>switchMap</w:t>
       </w:r>
       <w:proofErr w:type="spellEnd"/>
       <w:r>
         <w:rPr>
-          <w:sz w:val="36"/>
-          <w:szCs w:val="36"/>
-        </w:rPr>
-        <w:t xml:space="preserve">, </w:t>
-      </w:r>
-      <w:r>
-        <w:rPr>
-          <w:sz w:val="36"/>
-          <w:szCs w:val="36"/>
-        </w:rPr>
-        <w:t>we</w:t>
-      </w:r>
-      <w:r>
-        <w:rPr>
-          <w:sz w:val="36"/>
-          <w:szCs w:val="36"/>
-        </w:rPr>
-        <w:t xml:space="preserve"> could:</w:t>
+          <w:sz w:val="32"/>
+          <w:szCs w:val="32"/>
+        </w:rPr>
+        <w:t>, we could:</w:t>
       </w:r>
     </w:p>
     <w:p>
@@ -459,14 +480,14 @@
         </w:numPr>
         <w:jc w:val="both"/>
         <w:rPr>
-          <w:sz w:val="36"/>
-          <w:szCs w:val="36"/>
-        </w:rPr>
-      </w:pPr>
-      <w:r>
-        <w:rPr>
-          <w:sz w:val="36"/>
-          <w:szCs w:val="36"/>
+          <w:sz w:val="32"/>
+          <w:szCs w:val="32"/>
+        </w:rPr>
+      </w:pPr>
+      <w:r>
+        <w:rPr>
+          <w:sz w:val="32"/>
+          <w:szCs w:val="32"/>
         </w:rPr>
         <w:t>leak listeners</w:t>
       </w:r>
@@ -480,14 +501,14 @@
         </w:numPr>
         <w:jc w:val="both"/>
         <w:rPr>
-          <w:sz w:val="36"/>
-          <w:szCs w:val="36"/>
-        </w:rPr>
-      </w:pPr>
-      <w:r>
-        <w:rPr>
-          <w:sz w:val="36"/>
-          <w:szCs w:val="36"/>
+          <w:sz w:val="32"/>
+          <w:szCs w:val="32"/>
+        </w:rPr>
+      </w:pPr>
+      <w:r>
+        <w:rPr>
+          <w:sz w:val="32"/>
+          <w:szCs w:val="32"/>
         </w:rPr>
         <w:t>get wrong user data</w:t>
       </w:r>
@@ -501,14 +522,14 @@
         </w:numPr>
         <w:jc w:val="both"/>
         <w:rPr>
-          <w:sz w:val="36"/>
-          <w:szCs w:val="36"/>
-        </w:rPr>
-      </w:pPr>
-      <w:r>
-        <w:rPr>
-          <w:sz w:val="36"/>
-          <w:szCs w:val="36"/>
+          <w:sz w:val="32"/>
+          <w:szCs w:val="32"/>
+        </w:rPr>
+      </w:pPr>
+      <w:r>
+        <w:rPr>
+          <w:sz w:val="32"/>
+          <w:szCs w:val="32"/>
         </w:rPr>
         <w:t>crash our logic</w:t>
       </w:r>
@@ -517,14 +538,14 @@
       <w:pPr>
         <w:jc w:val="both"/>
         <w:rPr>
-          <w:sz w:val="36"/>
-          <w:szCs w:val="36"/>
-        </w:rPr>
-      </w:pPr>
-      <w:r>
-        <w:rPr>
-          <w:sz w:val="36"/>
-          <w:szCs w:val="36"/>
+          <w:sz w:val="32"/>
+          <w:szCs w:val="32"/>
+        </w:rPr>
+      </w:pPr>
+      <w:r>
+        <w:rPr>
+          <w:sz w:val="32"/>
+          <w:szCs w:val="32"/>
         </w:rPr>
         <w:t xml:space="preserve"># In one line, </w:t>
       </w:r>
@@ -533,16 +554,16 @@
         <w:rPr>
           <w:b/>
           <w:bCs/>
-          <w:sz w:val="36"/>
-          <w:szCs w:val="36"/>
+          <w:sz w:val="32"/>
+          <w:szCs w:val="32"/>
         </w:rPr>
         <w:t>switchMap</w:t>
       </w:r>
       <w:proofErr w:type="spellEnd"/>
       <w:r>
         <w:rPr>
-          <w:sz w:val="36"/>
-          <w:szCs w:val="36"/>
+          <w:sz w:val="32"/>
+          <w:szCs w:val="32"/>
         </w:rPr>
         <w:t xml:space="preserve"> transforms each emitted value into a new stream and automatically cancels the previous stream when a new value arrives.</w:t>
       </w:r>
@@ -551,23 +572,24 @@
       <w:pPr>
         <w:jc w:val="both"/>
         <w:rPr>
-          <w:sz w:val="36"/>
-          <w:szCs w:val="36"/>
-        </w:rPr>
-      </w:pPr>
-      <w:r>
-        <w:rPr>
-          <w:sz w:val="36"/>
-          <w:szCs w:val="36"/>
-        </w:rPr>
+          <w:sz w:val="32"/>
+          <w:szCs w:val="32"/>
+        </w:rPr>
+      </w:pPr>
+      <w:r>
+        <w:rPr>
+          <w:sz w:val="32"/>
+          <w:szCs w:val="32"/>
+        </w:rPr>
+        <w:lastRenderedPageBreak/>
         <w:t xml:space="preserve"># </w:t>
       </w:r>
       <w:r>
         <w:rPr>
           <w:b/>
           <w:bCs/>
-          <w:sz w:val="36"/>
-          <w:szCs w:val="36"/>
+          <w:sz w:val="32"/>
+          <w:szCs w:val="32"/>
         </w:rPr>
         <w:t>_</w:t>
       </w:r>
@@ -577,8 +599,8 @@
         <w:rPr>
           <w:b/>
           <w:bCs/>
-          <w:sz w:val="36"/>
-          <w:szCs w:val="36"/>
+          <w:sz w:val="32"/>
+          <w:szCs w:val="32"/>
         </w:rPr>
         <w:t>auth.authStateChanges</w:t>
       </w:r>
@@ -588,61 +610,33 @@
         <w:rPr>
           <w:b/>
           <w:bCs/>
-          <w:sz w:val="36"/>
-          <w:szCs w:val="36"/>
+          <w:sz w:val="32"/>
+          <w:szCs w:val="32"/>
         </w:rPr>
         <w:t>()</w:t>
       </w:r>
       <w:r>
         <w:rPr>
-          <w:sz w:val="36"/>
-          <w:szCs w:val="36"/>
-        </w:rPr>
-        <w:t xml:space="preserve"> returns</w:t>
-      </w:r>
-      <w:r>
-        <w:rPr>
-          <w:sz w:val="36"/>
-          <w:szCs w:val="36"/>
-        </w:rPr>
-        <w:t xml:space="preserve"> </w:t>
-      </w:r>
-      <w:r>
-        <w:rPr>
-          <w:sz w:val="36"/>
-          <w:szCs w:val="36"/>
-        </w:rPr>
-        <w:t>a</w:t>
-      </w:r>
-      <w:r>
-        <w:rPr>
-          <w:sz w:val="36"/>
-          <w:szCs w:val="36"/>
-        </w:rPr>
-        <w:t xml:space="preserve"> </w:t>
-      </w:r>
-      <w:r>
-        <w:rPr>
-          <w:b/>
-          <w:bCs/>
-          <w:sz w:val="36"/>
-          <w:szCs w:val="36"/>
+          <w:sz w:val="32"/>
+          <w:szCs w:val="32"/>
+        </w:rPr>
+        <w:t xml:space="preserve"> returns a </w:t>
+      </w:r>
+      <w:r>
+        <w:rPr>
+          <w:b/>
+          <w:bCs/>
+          <w:sz w:val="32"/>
+          <w:szCs w:val="32"/>
         </w:rPr>
         <w:t xml:space="preserve">Stream&lt;User?&gt; </w:t>
       </w:r>
       <w:r>
         <w:rPr>
-          <w:sz w:val="36"/>
-          <w:szCs w:val="36"/>
-        </w:rPr>
-        <w:t>object and it e</w:t>
-      </w:r>
-      <w:r>
-        <w:rPr>
-          <w:sz w:val="36"/>
-          <w:szCs w:val="36"/>
-        </w:rPr>
-        <w:t>mits whenever:</w:t>
+          <w:sz w:val="32"/>
+          <w:szCs w:val="32"/>
+        </w:rPr>
+        <w:t>object and it emits whenever:</w:t>
       </w:r>
     </w:p>
     <w:p>
@@ -654,16 +648,15 @@
         </w:numPr>
         <w:jc w:val="both"/>
         <w:rPr>
-          <w:sz w:val="36"/>
-          <w:szCs w:val="36"/>
-        </w:rPr>
-      </w:pPr>
-      <w:r>
-        <w:rPr>
-          <w:sz w:val="36"/>
-          <w:szCs w:val="36"/>
-        </w:rPr>
-        <w:lastRenderedPageBreak/>
+          <w:sz w:val="32"/>
+          <w:szCs w:val="32"/>
+        </w:rPr>
+      </w:pPr>
+      <w:r>
+        <w:rPr>
+          <w:sz w:val="32"/>
+          <w:szCs w:val="32"/>
+        </w:rPr>
         <w:t>user logs in</w:t>
       </w:r>
     </w:p>
@@ -676,14 +669,14 @@
         </w:numPr>
         <w:jc w:val="both"/>
         <w:rPr>
-          <w:sz w:val="36"/>
-          <w:szCs w:val="36"/>
-        </w:rPr>
-      </w:pPr>
-      <w:r>
-        <w:rPr>
-          <w:sz w:val="36"/>
-          <w:szCs w:val="36"/>
+          <w:sz w:val="32"/>
+          <w:szCs w:val="32"/>
+        </w:rPr>
+      </w:pPr>
+      <w:r>
+        <w:rPr>
+          <w:sz w:val="32"/>
+          <w:szCs w:val="32"/>
         </w:rPr>
         <w:t>user logs out</w:t>
       </w:r>
@@ -697,14 +690,14 @@
         </w:numPr>
         <w:jc w:val="both"/>
         <w:rPr>
-          <w:sz w:val="36"/>
-          <w:szCs w:val="36"/>
-        </w:rPr>
-      </w:pPr>
-      <w:r>
-        <w:rPr>
-          <w:sz w:val="36"/>
-          <w:szCs w:val="36"/>
+          <w:sz w:val="32"/>
+          <w:szCs w:val="32"/>
+        </w:rPr>
+      </w:pPr>
+      <w:r>
+        <w:rPr>
+          <w:sz w:val="32"/>
+          <w:szCs w:val="32"/>
         </w:rPr>
         <w:t>app restarts and auth state is restored</w:t>
       </w:r>
@@ -713,14 +706,14 @@
       <w:pPr>
         <w:jc w:val="both"/>
         <w:rPr>
-          <w:sz w:val="36"/>
-          <w:szCs w:val="36"/>
-        </w:rPr>
-      </w:pPr>
-      <w:r>
-        <w:rPr>
-          <w:sz w:val="36"/>
-          <w:szCs w:val="36"/>
+          <w:sz w:val="32"/>
+          <w:szCs w:val="32"/>
+        </w:rPr>
+      </w:pPr>
+      <w:r>
+        <w:rPr>
+          <w:sz w:val="32"/>
+          <w:szCs w:val="32"/>
         </w:rPr>
         <w:t>#</w:t>
       </w:r>
@@ -728,8 +721,8 @@
         <w:rPr>
           <w:b/>
           <w:bCs/>
-          <w:sz w:val="36"/>
-          <w:szCs w:val="36"/>
+          <w:sz w:val="32"/>
+          <w:szCs w:val="32"/>
         </w:rPr>
         <w:t xml:space="preserve"> </w:t>
       </w:r>
@@ -738,8 +731,8 @@
         <w:rPr>
           <w:b/>
           <w:bCs/>
-          <w:sz w:val="36"/>
-          <w:szCs w:val="36"/>
+          <w:sz w:val="32"/>
+          <w:szCs w:val="32"/>
         </w:rPr>
         <w:t>switchMap</w:t>
       </w:r>
@@ -748,8 +741,8 @@
         <w:rPr>
           <w:b/>
           <w:bCs/>
-          <w:sz w:val="36"/>
-          <w:szCs w:val="36"/>
+          <w:sz w:val="32"/>
+          <w:szCs w:val="32"/>
         </w:rPr>
         <w:t xml:space="preserve">((user) </w:t>
       </w:r>
@@ -758,8 +751,8 @@
         <w:rPr>
           <w:b/>
           <w:bCs/>
-          <w:sz w:val="36"/>
-          <w:szCs w:val="36"/>
+          <w:sz w:val="32"/>
+          <w:szCs w:val="32"/>
         </w:rPr>
         <w:t>{ ...</w:t>
       </w:r>
@@ -768,45 +761,31 @@
         <w:rPr>
           <w:b/>
           <w:bCs/>
-          <w:sz w:val="36"/>
-          <w:szCs w:val="36"/>
+          <w:sz w:val="32"/>
+          <w:szCs w:val="32"/>
         </w:rPr>
         <w:t xml:space="preserve"> }) </w:t>
       </w:r>
       <w:r>
         <w:rPr>
-          <w:sz w:val="36"/>
-          <w:szCs w:val="36"/>
-        </w:rPr>
-        <w:t>f</w:t>
-      </w:r>
-      <w:r>
-        <w:rPr>
-          <w:sz w:val="36"/>
-          <w:szCs w:val="36"/>
-        </w:rPr>
-        <w:t>or each auth change, decide which stream to listen to next</w:t>
-      </w:r>
-      <w:r>
-        <w:rPr>
-          <w:sz w:val="36"/>
-          <w:szCs w:val="36"/>
-        </w:rPr>
-        <w:t>.</w:t>
-      </w:r>
-    </w:p>
-    <w:p>
-      <w:pPr>
-        <w:jc w:val="both"/>
-        <w:rPr>
-          <w:sz w:val="36"/>
-          <w:szCs w:val="36"/>
-        </w:rPr>
-      </w:pPr>
-      <w:r>
-        <w:rPr>
-          <w:sz w:val="36"/>
-          <w:szCs w:val="36"/>
+          <w:sz w:val="32"/>
+          <w:szCs w:val="32"/>
+        </w:rPr>
+        <w:t>for each auth change, decide which stream to listen to next.</w:t>
+      </w:r>
+    </w:p>
+    <w:p>
+      <w:pPr>
+        <w:jc w:val="both"/>
+        <w:rPr>
+          <w:sz w:val="32"/>
+          <w:szCs w:val="32"/>
+        </w:rPr>
+      </w:pPr>
+      <w:r>
+        <w:rPr>
+          <w:sz w:val="32"/>
+          <w:szCs w:val="32"/>
         </w:rPr>
         <w:t xml:space="preserve"># If user is logged out, we return a stream that emits </w:t>
       </w:r>
@@ -814,15 +793,15 @@
         <w:rPr>
           <w:b/>
           <w:bCs/>
-          <w:sz w:val="36"/>
-          <w:szCs w:val="36"/>
+          <w:sz w:val="32"/>
+          <w:szCs w:val="32"/>
         </w:rPr>
         <w:t>null</w:t>
       </w:r>
       <w:r>
         <w:rPr>
-          <w:sz w:val="36"/>
-          <w:szCs w:val="36"/>
+          <w:sz w:val="32"/>
+          <w:szCs w:val="32"/>
         </w:rPr>
         <w:t xml:space="preserve">. NO database listening. But if user logged in, we switch to </w:t>
       </w:r>
@@ -831,16 +810,16 @@
         <w:rPr>
           <w:b/>
           <w:bCs/>
-          <w:sz w:val="36"/>
-          <w:szCs w:val="36"/>
+          <w:sz w:val="32"/>
+          <w:szCs w:val="32"/>
         </w:rPr>
         <w:t>Firestore</w:t>
       </w:r>
       <w:proofErr w:type="spellEnd"/>
       <w:r>
         <w:rPr>
-          <w:sz w:val="36"/>
-          <w:szCs w:val="36"/>
+          <w:sz w:val="32"/>
+          <w:szCs w:val="32"/>
         </w:rPr>
         <w:t xml:space="preserve"> user profile stream</w:t>
       </w:r>
@@ -849,14 +828,14 @@
       <w:pPr>
         <w:jc w:val="both"/>
         <w:rPr>
-          <w:sz w:val="36"/>
-          <w:szCs w:val="36"/>
-        </w:rPr>
-      </w:pPr>
-      <w:r>
-        <w:rPr>
-          <w:sz w:val="36"/>
-          <w:szCs w:val="36"/>
+          <w:sz w:val="32"/>
+          <w:szCs w:val="32"/>
+        </w:rPr>
+      </w:pPr>
+      <w:r>
+        <w:rPr>
+          <w:sz w:val="32"/>
+          <w:szCs w:val="32"/>
         </w:rPr>
         <w:t># Mental model:</w:t>
       </w:r>
@@ -867,16 +846,16 @@
         <w:rPr>
           <w:b/>
           <w:bCs/>
-          <w:sz w:val="36"/>
-          <w:szCs w:val="36"/>
-        </w:rPr>
-      </w:pPr>
-      <w:r>
-        <w:rPr>
-          <w:b/>
-          <w:bCs/>
-          <w:sz w:val="36"/>
-          <w:szCs w:val="36"/>
+          <w:sz w:val="32"/>
+          <w:szCs w:val="32"/>
+        </w:rPr>
+      </w:pPr>
+      <w:r>
+        <w:rPr>
+          <w:b/>
+          <w:bCs/>
+          <w:sz w:val="32"/>
+          <w:szCs w:val="32"/>
         </w:rPr>
         <w:t>Auth State Stream</w:t>
       </w:r>
@@ -887,16 +866,16 @@
         <w:rPr>
           <w:b/>
           <w:bCs/>
-          <w:sz w:val="36"/>
-          <w:szCs w:val="36"/>
-        </w:rPr>
-      </w:pPr>
-      <w:r>
-        <w:rPr>
-          <w:b/>
-          <w:bCs/>
-          <w:sz w:val="36"/>
-          <w:szCs w:val="36"/>
+          <w:sz w:val="32"/>
+          <w:szCs w:val="32"/>
+        </w:rPr>
+      </w:pPr>
+      <w:r>
+        <w:rPr>
+          <w:b/>
+          <w:bCs/>
+          <w:sz w:val="32"/>
+          <w:szCs w:val="32"/>
         </w:rPr>
         <w:t xml:space="preserve">        ↓</w:t>
       </w:r>
@@ -907,16 +886,16 @@
         <w:rPr>
           <w:b/>
           <w:bCs/>
-          <w:sz w:val="36"/>
-          <w:szCs w:val="36"/>
-        </w:rPr>
-      </w:pPr>
-      <w:r>
-        <w:rPr>
-          <w:b/>
-          <w:bCs/>
-          <w:sz w:val="36"/>
-          <w:szCs w:val="36"/>
+          <w:sz w:val="32"/>
+          <w:szCs w:val="32"/>
+        </w:rPr>
+      </w:pPr>
+      <w:r>
+        <w:rPr>
+          <w:b/>
+          <w:bCs/>
+          <w:sz w:val="32"/>
+          <w:szCs w:val="32"/>
         </w:rPr>
         <w:t xml:space="preserve">   </w:t>
       </w:r>
@@ -925,8 +904,8 @@
         <w:rPr>
           <w:b/>
           <w:bCs/>
-          <w:sz w:val="36"/>
-          <w:szCs w:val="36"/>
+          <w:sz w:val="32"/>
+          <w:szCs w:val="32"/>
         </w:rPr>
         <w:t>switchMap</w:t>
       </w:r>
@@ -938,16 +917,16 @@
         <w:rPr>
           <w:b/>
           <w:bCs/>
-          <w:sz w:val="36"/>
-          <w:szCs w:val="36"/>
-        </w:rPr>
-      </w:pPr>
-      <w:r>
-        <w:rPr>
-          <w:b/>
-          <w:bCs/>
-          <w:sz w:val="36"/>
-          <w:szCs w:val="36"/>
+          <w:sz w:val="32"/>
+          <w:szCs w:val="32"/>
+        </w:rPr>
+      </w:pPr>
+      <w:r>
+        <w:rPr>
+          <w:b/>
+          <w:bCs/>
+          <w:sz w:val="32"/>
+          <w:szCs w:val="32"/>
         </w:rPr>
         <w:t xml:space="preserve">        ↓</w:t>
       </w:r>
@@ -958,16 +937,16 @@
         <w:rPr>
           <w:b/>
           <w:bCs/>
-          <w:sz w:val="36"/>
-          <w:szCs w:val="36"/>
-        </w:rPr>
-      </w:pPr>
-      <w:r>
-        <w:rPr>
-          <w:b/>
-          <w:bCs/>
-          <w:sz w:val="36"/>
-          <w:szCs w:val="36"/>
+          <w:sz w:val="32"/>
+          <w:szCs w:val="32"/>
+        </w:rPr>
+      </w:pPr>
+      <w:r>
+        <w:rPr>
+          <w:b/>
+          <w:bCs/>
+          <w:sz w:val="32"/>
+          <w:szCs w:val="32"/>
         </w:rPr>
         <w:t xml:space="preserve">  User Profile Stream (latest only)</w:t>
       </w:r>
@@ -979,17 +958,17 @@
           <w:b/>
           <w:bCs/>
           <w:color w:val="D86DCB" w:themeColor="accent5" w:themeTint="99"/>
-          <w:sz w:val="36"/>
-          <w:szCs w:val="36"/>
-        </w:rPr>
-      </w:pPr>
-      <w:r>
-        <w:rPr>
-          <w:b/>
-          <w:bCs/>
-          <w:color w:val="D86DCB" w:themeColor="accent5" w:themeTint="99"/>
-          <w:sz w:val="36"/>
-          <w:szCs w:val="36"/>
+          <w:sz w:val="32"/>
+          <w:szCs w:val="32"/>
+        </w:rPr>
+      </w:pPr>
+      <w:r>
+        <w:rPr>
+          <w:b/>
+          <w:bCs/>
+          <w:color w:val="D86DCB" w:themeColor="accent5" w:themeTint="99"/>
+          <w:sz w:val="32"/>
+          <w:szCs w:val="32"/>
         </w:rPr>
         <w:t>Stream&lt;</w:t>
       </w:r>
@@ -999,8 +978,8 @@
           <w:b/>
           <w:bCs/>
           <w:color w:val="D86DCB" w:themeColor="accent5" w:themeTint="99"/>
-          <w:sz w:val="36"/>
-          <w:szCs w:val="36"/>
+          <w:sz w:val="32"/>
+          <w:szCs w:val="32"/>
         </w:rPr>
         <w:t>AppUser</w:t>
       </w:r>
@@ -1010,8 +989,8 @@
           <w:b/>
           <w:bCs/>
           <w:color w:val="D86DCB" w:themeColor="accent5" w:themeTint="99"/>
-          <w:sz w:val="36"/>
-          <w:szCs w:val="36"/>
+          <w:sz w:val="32"/>
+          <w:szCs w:val="32"/>
         </w:rPr>
         <w:t xml:space="preserve">&gt; </w:t>
       </w:r>
@@ -1022,8 +1001,8 @@
           <w:b/>
           <w:bCs/>
           <w:color w:val="D86DCB" w:themeColor="accent5" w:themeTint="99"/>
-          <w:sz w:val="36"/>
-          <w:szCs w:val="36"/>
+          <w:sz w:val="32"/>
+          <w:szCs w:val="32"/>
         </w:rPr>
         <w:t>streamUserProfile</w:t>
       </w:r>
@@ -1033,8 +1012,8 @@
           <w:b/>
           <w:bCs/>
           <w:color w:val="D86DCB" w:themeColor="accent5" w:themeTint="99"/>
-          <w:sz w:val="36"/>
-          <w:szCs w:val="36"/>
+          <w:sz w:val="32"/>
+          <w:szCs w:val="32"/>
         </w:rPr>
         <w:t>(</w:t>
       </w:r>
@@ -1044,8 +1023,8 @@
           <w:b/>
           <w:bCs/>
           <w:color w:val="D86DCB" w:themeColor="accent5" w:themeTint="99"/>
-          <w:sz w:val="36"/>
-          <w:szCs w:val="36"/>
+          <w:sz w:val="32"/>
+          <w:szCs w:val="32"/>
         </w:rPr>
         <w:t xml:space="preserve">String </w:t>
       </w:r>
@@ -1055,8 +1034,8 @@
           <w:b/>
           <w:bCs/>
           <w:color w:val="D86DCB" w:themeColor="accent5" w:themeTint="99"/>
-          <w:sz w:val="36"/>
-          <w:szCs w:val="36"/>
+          <w:sz w:val="32"/>
+          <w:szCs w:val="32"/>
         </w:rPr>
         <w:t>uid</w:t>
       </w:r>
@@ -1066,8 +1045,8 @@
           <w:b/>
           <w:bCs/>
           <w:color w:val="D86DCB" w:themeColor="accent5" w:themeTint="99"/>
-          <w:sz w:val="36"/>
-          <w:szCs w:val="36"/>
+          <w:sz w:val="32"/>
+          <w:szCs w:val="32"/>
         </w:rPr>
         <w:t>) {</w:t>
       </w:r>
@@ -1079,17 +1058,17 @@
           <w:b/>
           <w:bCs/>
           <w:color w:val="D86DCB" w:themeColor="accent5" w:themeTint="99"/>
-          <w:sz w:val="36"/>
-          <w:szCs w:val="36"/>
-        </w:rPr>
-      </w:pPr>
-      <w:r>
-        <w:rPr>
-          <w:b/>
-          <w:bCs/>
-          <w:color w:val="D86DCB" w:themeColor="accent5" w:themeTint="99"/>
-          <w:sz w:val="36"/>
-          <w:szCs w:val="36"/>
+          <w:sz w:val="32"/>
+          <w:szCs w:val="32"/>
+        </w:rPr>
+      </w:pPr>
+      <w:r>
+        <w:rPr>
+          <w:b/>
+          <w:bCs/>
+          <w:color w:val="D86DCB" w:themeColor="accent5" w:themeTint="99"/>
+          <w:sz w:val="32"/>
+          <w:szCs w:val="32"/>
         </w:rPr>
         <w:t xml:space="preserve">  return </w:t>
       </w:r>
@@ -1099,8 +1078,8 @@
           <w:b/>
           <w:bCs/>
           <w:color w:val="D86DCB" w:themeColor="accent5" w:themeTint="99"/>
-          <w:sz w:val="36"/>
-          <w:szCs w:val="36"/>
+          <w:sz w:val="32"/>
+          <w:szCs w:val="32"/>
         </w:rPr>
         <w:t>FirebaseFirestore.instance</w:t>
       </w:r>
@@ -1113,17 +1092,17 @@
           <w:b/>
           <w:bCs/>
           <w:color w:val="D86DCB" w:themeColor="accent5" w:themeTint="99"/>
-          <w:sz w:val="36"/>
-          <w:szCs w:val="36"/>
-        </w:rPr>
-      </w:pPr>
-      <w:r>
-        <w:rPr>
-          <w:b/>
-          <w:bCs/>
-          <w:color w:val="D86DCB" w:themeColor="accent5" w:themeTint="99"/>
-          <w:sz w:val="36"/>
-          <w:szCs w:val="36"/>
+          <w:sz w:val="32"/>
+          <w:szCs w:val="32"/>
+        </w:rPr>
+      </w:pPr>
+      <w:r>
+        <w:rPr>
+          <w:b/>
+          <w:bCs/>
+          <w:color w:val="D86DCB" w:themeColor="accent5" w:themeTint="99"/>
+          <w:sz w:val="32"/>
+          <w:szCs w:val="32"/>
         </w:rPr>
         <w:t xml:space="preserve">      </w:t>
       </w:r>
@@ -1133,8 +1112,8 @@
           <w:b/>
           <w:bCs/>
           <w:color w:val="D86DCB" w:themeColor="accent5" w:themeTint="99"/>
-          <w:sz w:val="36"/>
-          <w:szCs w:val="36"/>
+          <w:sz w:val="32"/>
+          <w:szCs w:val="32"/>
         </w:rPr>
         <w:t>.collection</w:t>
       </w:r>
@@ -1144,8 +1123,8 @@
           <w:b/>
           <w:bCs/>
           <w:color w:val="D86DCB" w:themeColor="accent5" w:themeTint="99"/>
-          <w:sz w:val="36"/>
-          <w:szCs w:val="36"/>
+          <w:sz w:val="32"/>
+          <w:szCs w:val="32"/>
         </w:rPr>
         <w:t>('users')</w:t>
       </w:r>
@@ -1157,17 +1136,17 @@
           <w:b/>
           <w:bCs/>
           <w:color w:val="D86DCB" w:themeColor="accent5" w:themeTint="99"/>
-          <w:sz w:val="36"/>
-          <w:szCs w:val="36"/>
-        </w:rPr>
-      </w:pPr>
-      <w:r>
-        <w:rPr>
-          <w:b/>
-          <w:bCs/>
-          <w:color w:val="D86DCB" w:themeColor="accent5" w:themeTint="99"/>
-          <w:sz w:val="36"/>
-          <w:szCs w:val="36"/>
+          <w:sz w:val="32"/>
+          <w:szCs w:val="32"/>
+        </w:rPr>
+      </w:pPr>
+      <w:r>
+        <w:rPr>
+          <w:b/>
+          <w:bCs/>
+          <w:color w:val="D86DCB" w:themeColor="accent5" w:themeTint="99"/>
+          <w:sz w:val="32"/>
+          <w:szCs w:val="32"/>
         </w:rPr>
         <w:t xml:space="preserve">      .doc(</w:t>
       </w:r>
@@ -1177,8 +1156,8 @@
           <w:b/>
           <w:bCs/>
           <w:color w:val="D86DCB" w:themeColor="accent5" w:themeTint="99"/>
-          <w:sz w:val="36"/>
-          <w:szCs w:val="36"/>
+          <w:sz w:val="32"/>
+          <w:szCs w:val="32"/>
         </w:rPr>
         <w:t>uid</w:t>
       </w:r>
@@ -1188,8 +1167,8 @@
           <w:b/>
           <w:bCs/>
           <w:color w:val="D86DCB" w:themeColor="accent5" w:themeTint="99"/>
-          <w:sz w:val="36"/>
-          <w:szCs w:val="36"/>
+          <w:sz w:val="32"/>
+          <w:szCs w:val="32"/>
         </w:rPr>
         <w:t>)</w:t>
       </w:r>
@@ -1201,17 +1180,17 @@
           <w:b/>
           <w:bCs/>
           <w:color w:val="D86DCB" w:themeColor="accent5" w:themeTint="99"/>
-          <w:sz w:val="36"/>
-          <w:szCs w:val="36"/>
-        </w:rPr>
-      </w:pPr>
-      <w:r>
-        <w:rPr>
-          <w:b/>
-          <w:bCs/>
-          <w:color w:val="D86DCB" w:themeColor="accent5" w:themeTint="99"/>
-          <w:sz w:val="36"/>
-          <w:szCs w:val="36"/>
+          <w:sz w:val="32"/>
+          <w:szCs w:val="32"/>
+        </w:rPr>
+      </w:pPr>
+      <w:r>
+        <w:rPr>
+          <w:b/>
+          <w:bCs/>
+          <w:color w:val="D86DCB" w:themeColor="accent5" w:themeTint="99"/>
+          <w:sz w:val="32"/>
+          <w:szCs w:val="32"/>
         </w:rPr>
         <w:t xml:space="preserve">      </w:t>
       </w:r>
@@ -1221,8 +1200,8 @@
           <w:b/>
           <w:bCs/>
           <w:color w:val="D86DCB" w:themeColor="accent5" w:themeTint="99"/>
-          <w:sz w:val="36"/>
-          <w:szCs w:val="36"/>
+          <w:sz w:val="32"/>
+          <w:szCs w:val="32"/>
         </w:rPr>
         <w:t>.snapshots</w:t>
       </w:r>
@@ -1232,8 +1211,8 @@
           <w:b/>
           <w:bCs/>
           <w:color w:val="D86DCB" w:themeColor="accent5" w:themeTint="99"/>
-          <w:sz w:val="36"/>
-          <w:szCs w:val="36"/>
+          <w:sz w:val="32"/>
+          <w:szCs w:val="32"/>
         </w:rPr>
         <w:t>()</w:t>
       </w:r>
@@ -1245,17 +1224,17 @@
           <w:b/>
           <w:bCs/>
           <w:color w:val="D86DCB" w:themeColor="accent5" w:themeTint="99"/>
-          <w:sz w:val="36"/>
-          <w:szCs w:val="36"/>
-        </w:rPr>
-      </w:pPr>
-      <w:r>
-        <w:rPr>
-          <w:b/>
-          <w:bCs/>
-          <w:color w:val="D86DCB" w:themeColor="accent5" w:themeTint="99"/>
-          <w:sz w:val="36"/>
-          <w:szCs w:val="36"/>
+          <w:sz w:val="32"/>
+          <w:szCs w:val="32"/>
+        </w:rPr>
+      </w:pPr>
+      <w:r>
+        <w:rPr>
+          <w:b/>
+          <w:bCs/>
+          <w:color w:val="D86DCB" w:themeColor="accent5" w:themeTint="99"/>
+          <w:sz w:val="32"/>
+          <w:szCs w:val="32"/>
         </w:rPr>
         <w:t xml:space="preserve">      </w:t>
       </w:r>
@@ -1265,8 +1244,8 @@
           <w:b/>
           <w:bCs/>
           <w:color w:val="D86DCB" w:themeColor="accent5" w:themeTint="99"/>
-          <w:sz w:val="36"/>
-          <w:szCs w:val="36"/>
+          <w:sz w:val="32"/>
+          <w:szCs w:val="32"/>
         </w:rPr>
         <w:t>.map</w:t>
       </w:r>
@@ -1276,8 +1255,8 @@
           <w:b/>
           <w:bCs/>
           <w:color w:val="D86DCB" w:themeColor="accent5" w:themeTint="99"/>
-          <w:sz w:val="36"/>
-          <w:szCs w:val="36"/>
+          <w:sz w:val="32"/>
+          <w:szCs w:val="32"/>
         </w:rPr>
         <w:t xml:space="preserve">((doc) =&gt; </w:t>
       </w:r>
@@ -1287,8 +1266,8 @@
           <w:b/>
           <w:bCs/>
           <w:color w:val="D86DCB" w:themeColor="accent5" w:themeTint="99"/>
-          <w:sz w:val="36"/>
-          <w:szCs w:val="36"/>
+          <w:sz w:val="32"/>
+          <w:szCs w:val="32"/>
         </w:rPr>
         <w:t>AppUser.fromMap</w:t>
       </w:r>
@@ -1298,8 +1277,8 @@
           <w:b/>
           <w:bCs/>
           <w:color w:val="D86DCB" w:themeColor="accent5" w:themeTint="99"/>
-          <w:sz w:val="36"/>
-          <w:szCs w:val="36"/>
+          <w:sz w:val="32"/>
+          <w:szCs w:val="32"/>
         </w:rPr>
         <w:t>(</w:t>
       </w:r>
@@ -1309,8 +1288,8 @@
           <w:b/>
           <w:bCs/>
           <w:color w:val="D86DCB" w:themeColor="accent5" w:themeTint="99"/>
-          <w:sz w:val="36"/>
-          <w:szCs w:val="36"/>
+          <w:sz w:val="32"/>
+          <w:szCs w:val="32"/>
         </w:rPr>
         <w:t>doc.data</w:t>
       </w:r>
@@ -1320,8 +1299,8 @@
           <w:b/>
           <w:bCs/>
           <w:color w:val="D86DCB" w:themeColor="accent5" w:themeTint="99"/>
-          <w:sz w:val="36"/>
-          <w:szCs w:val="36"/>
+          <w:sz w:val="32"/>
+          <w:szCs w:val="32"/>
         </w:rPr>
         <w:t>()!));</w:t>
       </w:r>
@@ -1333,17 +1312,17 @@
           <w:b/>
           <w:bCs/>
           <w:color w:val="D86DCB" w:themeColor="accent5" w:themeTint="99"/>
-          <w:sz w:val="36"/>
-          <w:szCs w:val="36"/>
-        </w:rPr>
-      </w:pPr>
-      <w:r>
-        <w:rPr>
-          <w:b/>
-          <w:bCs/>
-          <w:color w:val="D86DCB" w:themeColor="accent5" w:themeTint="99"/>
-          <w:sz w:val="36"/>
-          <w:szCs w:val="36"/>
+          <w:sz w:val="32"/>
+          <w:szCs w:val="32"/>
+        </w:rPr>
+      </w:pPr>
+      <w:r>
+        <w:rPr>
+          <w:b/>
+          <w:bCs/>
+          <w:color w:val="D86DCB" w:themeColor="accent5" w:themeTint="99"/>
+          <w:sz w:val="32"/>
+          <w:szCs w:val="32"/>
         </w:rPr>
         <w:t>}</w:t>
       </w:r>
@@ -1352,23 +1331,23 @@
       <w:pPr>
         <w:jc w:val="both"/>
         <w:rPr>
-          <w:sz w:val="36"/>
-          <w:szCs w:val="36"/>
-        </w:rPr>
-      </w:pPr>
-      <w:r>
-        <w:rPr>
-          <w:b/>
-          <w:bCs/>
-          <w:sz w:val="36"/>
-          <w:szCs w:val="36"/>
+          <w:sz w:val="32"/>
+          <w:szCs w:val="32"/>
+        </w:rPr>
+      </w:pPr>
+      <w:r>
+        <w:rPr>
+          <w:b/>
+          <w:bCs/>
+          <w:sz w:val="32"/>
+          <w:szCs w:val="32"/>
         </w:rPr>
         <w:t>Note:</w:t>
       </w:r>
       <w:r>
         <w:rPr>
-          <w:sz w:val="36"/>
-          <w:szCs w:val="36"/>
+          <w:sz w:val="32"/>
+          <w:szCs w:val="32"/>
         </w:rPr>
         <w:t xml:space="preserve"> There’s also</w:t>
       </w:r>
@@ -1376,8 +1355,8 @@
         <w:rPr>
           <w:b/>
           <w:bCs/>
-          <w:sz w:val="36"/>
-          <w:szCs w:val="36"/>
+          <w:sz w:val="32"/>
+          <w:szCs w:val="32"/>
         </w:rPr>
         <w:t xml:space="preserve"> </w:t>
       </w:r>
@@ -1387,8 +1366,8 @@
         <w:rPr>
           <w:b/>
           <w:bCs/>
-          <w:sz w:val="36"/>
-          <w:szCs w:val="36"/>
+          <w:sz w:val="32"/>
+          <w:szCs w:val="32"/>
         </w:rPr>
         <w:t>asyncMap</w:t>
       </w:r>
@@ -1397,8 +1376,8 @@
         <w:rPr>
           <w:b/>
           <w:bCs/>
-          <w:sz w:val="36"/>
-          <w:szCs w:val="36"/>
+          <w:sz w:val="32"/>
+          <w:szCs w:val="32"/>
         </w:rPr>
         <w:t>(</w:t>
       </w:r>
@@ -1407,15 +1386,15 @@
         <w:rPr>
           <w:b/>
           <w:bCs/>
-          <w:sz w:val="36"/>
-          <w:szCs w:val="36"/>
+          <w:sz w:val="32"/>
+          <w:szCs w:val="32"/>
         </w:rPr>
         <w:t xml:space="preserve">) </w:t>
       </w:r>
       <w:r>
         <w:rPr>
-          <w:sz w:val="36"/>
-          <w:szCs w:val="36"/>
+          <w:sz w:val="32"/>
+          <w:szCs w:val="32"/>
         </w:rPr>
         <w:t>method too.</w:t>
       </w:r>
@@ -1424,19 +1403,19 @@
       <w:pPr>
         <w:jc w:val="both"/>
         <w:rPr>
-          <w:sz w:val="36"/>
-          <w:szCs w:val="36"/>
-        </w:rPr>
-      </w:pPr>
-    </w:p>
-    <w:p>
-      <w:pPr>
-        <w:jc w:val="both"/>
-        <w:rPr>
-          <w:b/>
-          <w:bCs/>
-          <w:sz w:val="36"/>
-          <w:szCs w:val="36"/>
+          <w:sz w:val="32"/>
+          <w:szCs w:val="32"/>
+        </w:rPr>
+      </w:pPr>
+    </w:p>
+    <w:p>
+      <w:pPr>
+        <w:jc w:val="both"/>
+        <w:rPr>
+          <w:b/>
+          <w:bCs/>
+          <w:sz w:val="32"/>
+          <w:szCs w:val="32"/>
         </w:rPr>
       </w:pPr>
       <w:proofErr w:type="gramStart"/>
@@ -1444,8 +1423,8 @@
         <w:rPr>
           <w:b/>
           <w:bCs/>
-          <w:sz w:val="36"/>
-          <w:szCs w:val="36"/>
+          <w:sz w:val="32"/>
+          <w:szCs w:val="32"/>
         </w:rPr>
         <w:t>.then</w:t>
       </w:r>
@@ -1454,8 +1433,8 @@
         <w:rPr>
           <w:b/>
           <w:bCs/>
-          <w:sz w:val="36"/>
-          <w:szCs w:val="36"/>
+          <w:sz w:val="32"/>
+          <w:szCs w:val="32"/>
         </w:rPr>
         <w:t>() method:</w:t>
       </w:r>
@@ -1466,22 +1445,22 @@
         <w:rPr>
           <w:b/>
           <w:bCs/>
-          <w:sz w:val="36"/>
-          <w:szCs w:val="36"/>
-        </w:rPr>
-      </w:pPr>
-      <w:r>
-        <w:rPr>
-          <w:sz w:val="36"/>
-          <w:szCs w:val="36"/>
+          <w:sz w:val="32"/>
+          <w:szCs w:val="32"/>
+        </w:rPr>
+      </w:pPr>
+      <w:r>
+        <w:rPr>
+          <w:sz w:val="32"/>
+          <w:szCs w:val="32"/>
         </w:rPr>
         <w:t xml:space="preserve"># We can </w:t>
       </w:r>
       <w:proofErr w:type="gramStart"/>
       <w:r>
         <w:rPr>
-          <w:sz w:val="36"/>
-          <w:szCs w:val="36"/>
+          <w:sz w:val="32"/>
+          <w:szCs w:val="32"/>
         </w:rPr>
         <w:t>use</w:t>
       </w:r>
@@ -1489,8 +1468,8 @@
         <w:rPr>
           <w:b/>
           <w:bCs/>
-          <w:sz w:val="36"/>
-          <w:szCs w:val="36"/>
+          <w:sz w:val="32"/>
+          <w:szCs w:val="32"/>
         </w:rPr>
         <w:t xml:space="preserve"> .then</w:t>
       </w:r>
@@ -1499,15 +1478,15 @@
         <w:rPr>
           <w:b/>
           <w:bCs/>
-          <w:sz w:val="36"/>
-          <w:szCs w:val="36"/>
+          <w:sz w:val="32"/>
+          <w:szCs w:val="32"/>
         </w:rPr>
         <w:t>((value) {})</w:t>
       </w:r>
       <w:r>
         <w:rPr>
-          <w:sz w:val="36"/>
-          <w:szCs w:val="36"/>
+          <w:sz w:val="32"/>
+          <w:szCs w:val="32"/>
         </w:rPr>
         <w:t xml:space="preserve"> method to do something after a function is done doing something. It’s like hey after this code runs do this extra stuff. It takes a value internally from Flutter which is given by the function after it’s done. If we don’t care about this value just ignore it using </w:t>
       </w:r>
@@ -1515,23 +1494,23 @@
         <w:rPr>
           <w:b/>
           <w:bCs/>
-          <w:sz w:val="36"/>
-          <w:szCs w:val="36"/>
+          <w:sz w:val="32"/>
+          <w:szCs w:val="32"/>
         </w:rPr>
         <w:t xml:space="preserve">_ </w:t>
       </w:r>
       <w:r>
         <w:rPr>
-          <w:sz w:val="36"/>
-          <w:szCs w:val="36"/>
+          <w:sz w:val="32"/>
+          <w:szCs w:val="32"/>
         </w:rPr>
         <w:t xml:space="preserve">underscore like </w:t>
       </w:r>
       <w:proofErr w:type="gramStart"/>
       <w:r>
         <w:rPr>
-          <w:sz w:val="36"/>
-          <w:szCs w:val="36"/>
+          <w:sz w:val="32"/>
+          <w:szCs w:val="32"/>
         </w:rPr>
         <w:t xml:space="preserve">this </w:t>
       </w:r>
@@ -1539,8 +1518,8 @@
         <w:rPr>
           <w:b/>
           <w:bCs/>
-          <w:sz w:val="36"/>
-          <w:szCs w:val="36"/>
+          <w:sz w:val="32"/>
+          <w:szCs w:val="32"/>
         </w:rPr>
         <w:t>.then</w:t>
       </w:r>
@@ -1549,8 +1528,8 @@
         <w:rPr>
           <w:b/>
           <w:bCs/>
-          <w:sz w:val="36"/>
-          <w:szCs w:val="36"/>
+          <w:sz w:val="32"/>
+          <w:szCs w:val="32"/>
         </w:rPr>
         <w:t>((_) {})</w:t>
       </w:r>
@@ -1559,22 +1538,22 @@
       <w:pPr>
         <w:jc w:val="both"/>
         <w:rPr>
-          <w:sz w:val="36"/>
-          <w:szCs w:val="36"/>
-        </w:rPr>
-      </w:pPr>
-      <w:r>
-        <w:rPr>
-          <w:sz w:val="36"/>
-          <w:szCs w:val="36"/>
+          <w:sz w:val="32"/>
+          <w:szCs w:val="32"/>
+        </w:rPr>
+      </w:pPr>
+      <w:r>
+        <w:rPr>
+          <w:sz w:val="32"/>
+          <w:szCs w:val="32"/>
         </w:rPr>
         <w:t xml:space="preserve"># We can also do some error handling with it </w:t>
       </w:r>
       <w:proofErr w:type="gramStart"/>
       <w:r>
         <w:rPr>
-          <w:sz w:val="36"/>
-          <w:szCs w:val="36"/>
+          <w:sz w:val="32"/>
+          <w:szCs w:val="32"/>
         </w:rPr>
         <w:t xml:space="preserve">using </w:t>
       </w:r>
@@ -1582,8 +1561,8 @@
         <w:rPr>
           <w:b/>
           <w:bCs/>
-          <w:sz w:val="36"/>
-          <w:szCs w:val="36"/>
+          <w:sz w:val="32"/>
+          <w:szCs w:val="32"/>
         </w:rPr>
         <w:t>.</w:t>
       </w:r>
@@ -1592,8 +1571,8 @@
         <w:rPr>
           <w:b/>
           <w:bCs/>
-          <w:sz w:val="36"/>
-          <w:szCs w:val="36"/>
+          <w:sz w:val="32"/>
+          <w:szCs w:val="32"/>
         </w:rPr>
         <w:t>catchError</w:t>
       </w:r>
@@ -1603,15 +1582,15 @@
         <w:rPr>
           <w:b/>
           <w:bCs/>
-          <w:sz w:val="36"/>
-          <w:szCs w:val="36"/>
+          <w:sz w:val="32"/>
+          <w:szCs w:val="32"/>
         </w:rPr>
         <w:t>()</w:t>
       </w:r>
       <w:r>
         <w:rPr>
-          <w:sz w:val="36"/>
-          <w:szCs w:val="36"/>
+          <w:sz w:val="32"/>
+          <w:szCs w:val="32"/>
         </w:rPr>
         <w:t xml:space="preserve"> method, but it’s optional</w:t>
       </w:r>
@@ -1623,8 +1602,8 @@
           <w:b/>
           <w:bCs/>
           <w:color w:val="D86DCB" w:themeColor="accent5" w:themeTint="99"/>
-          <w:sz w:val="36"/>
-          <w:szCs w:val="36"/>
+          <w:sz w:val="32"/>
+          <w:szCs w:val="32"/>
         </w:rPr>
       </w:pPr>
       <w:proofErr w:type="spellStart"/>
@@ -1634,8 +1613,8 @@
           <w:b/>
           <w:bCs/>
           <w:color w:val="D86DCB" w:themeColor="accent5" w:themeTint="99"/>
-          <w:sz w:val="36"/>
-          <w:szCs w:val="36"/>
+          <w:sz w:val="32"/>
+          <w:szCs w:val="32"/>
         </w:rPr>
         <w:t>myFunc</w:t>
       </w:r>
@@ -1645,8 +1624,8 @@
           <w:b/>
           <w:bCs/>
           <w:color w:val="D86DCB" w:themeColor="accent5" w:themeTint="99"/>
-          <w:sz w:val="36"/>
-          <w:szCs w:val="36"/>
+          <w:sz w:val="32"/>
+          <w:szCs w:val="32"/>
         </w:rPr>
         <w:t>(</w:t>
       </w:r>
@@ -1656,8 +1635,8 @@
           <w:b/>
           <w:bCs/>
           <w:color w:val="D86DCB" w:themeColor="accent5" w:themeTint="99"/>
-          <w:sz w:val="36"/>
-          <w:szCs w:val="36"/>
+          <w:sz w:val="32"/>
+          <w:szCs w:val="32"/>
         </w:rPr>
         <w:t>)</w:t>
       </w:r>
@@ -1669,17 +1648,17 @@
           <w:b/>
           <w:bCs/>
           <w:color w:val="D86DCB" w:themeColor="accent5" w:themeTint="99"/>
-          <w:sz w:val="36"/>
-          <w:szCs w:val="36"/>
-        </w:rPr>
-      </w:pPr>
-      <w:r>
-        <w:rPr>
-          <w:b/>
-          <w:bCs/>
-          <w:color w:val="D86DCB" w:themeColor="accent5" w:themeTint="99"/>
-          <w:sz w:val="36"/>
-          <w:szCs w:val="36"/>
+          <w:sz w:val="32"/>
+          <w:szCs w:val="32"/>
+        </w:rPr>
+      </w:pPr>
+      <w:r>
+        <w:rPr>
+          <w:b/>
+          <w:bCs/>
+          <w:color w:val="D86DCB" w:themeColor="accent5" w:themeTint="99"/>
+          <w:sz w:val="32"/>
+          <w:szCs w:val="32"/>
         </w:rPr>
         <w:t xml:space="preserve">    </w:t>
       </w:r>
@@ -1689,8 +1668,8 @@
           <w:b/>
           <w:bCs/>
           <w:color w:val="D86DCB" w:themeColor="accent5" w:themeTint="99"/>
-          <w:sz w:val="36"/>
-          <w:szCs w:val="36"/>
+          <w:sz w:val="32"/>
+          <w:szCs w:val="32"/>
         </w:rPr>
         <w:t>.then</w:t>
       </w:r>
@@ -1700,8 +1679,8 @@
           <w:b/>
           <w:bCs/>
           <w:color w:val="D86DCB" w:themeColor="accent5" w:themeTint="99"/>
-          <w:sz w:val="36"/>
-          <w:szCs w:val="36"/>
+          <w:sz w:val="32"/>
+          <w:szCs w:val="32"/>
         </w:rPr>
         <w:t>((value) {</w:t>
       </w:r>
@@ -1713,17 +1692,17 @@
           <w:b/>
           <w:bCs/>
           <w:color w:val="D86DCB" w:themeColor="accent5" w:themeTint="99"/>
-          <w:sz w:val="36"/>
-          <w:szCs w:val="36"/>
-        </w:rPr>
-      </w:pPr>
-      <w:r>
-        <w:rPr>
-          <w:b/>
-          <w:bCs/>
-          <w:color w:val="D86DCB" w:themeColor="accent5" w:themeTint="99"/>
-          <w:sz w:val="36"/>
-          <w:szCs w:val="36"/>
+          <w:sz w:val="32"/>
+          <w:szCs w:val="32"/>
+        </w:rPr>
+      </w:pPr>
+      <w:r>
+        <w:rPr>
+          <w:b/>
+          <w:bCs/>
+          <w:color w:val="D86DCB" w:themeColor="accent5" w:themeTint="99"/>
+          <w:sz w:val="32"/>
+          <w:szCs w:val="32"/>
         </w:rPr>
         <w:t xml:space="preserve">      /// </w:t>
       </w:r>
@@ -1733,8 +1712,8 @@
           <w:b/>
           <w:bCs/>
           <w:color w:val="D86DCB" w:themeColor="accent5" w:themeTint="99"/>
-          <w:sz w:val="36"/>
-          <w:szCs w:val="36"/>
+          <w:sz w:val="32"/>
+          <w:szCs w:val="32"/>
         </w:rPr>
         <w:t>doSomethingWith</w:t>
       </w:r>
@@ -1744,8 +1723,8 @@
           <w:b/>
           <w:bCs/>
           <w:color w:val="D86DCB" w:themeColor="accent5" w:themeTint="99"/>
-          <w:sz w:val="36"/>
-          <w:szCs w:val="36"/>
+          <w:sz w:val="32"/>
+          <w:szCs w:val="32"/>
         </w:rPr>
         <w:t>(value);</w:t>
       </w:r>
@@ -1757,17 +1736,17 @@
           <w:b/>
           <w:bCs/>
           <w:color w:val="D86DCB" w:themeColor="accent5" w:themeTint="99"/>
-          <w:sz w:val="36"/>
-          <w:szCs w:val="36"/>
-        </w:rPr>
-      </w:pPr>
-      <w:r>
-        <w:rPr>
-          <w:b/>
-          <w:bCs/>
-          <w:color w:val="D86DCB" w:themeColor="accent5" w:themeTint="99"/>
-          <w:sz w:val="36"/>
-          <w:szCs w:val="36"/>
+          <w:sz w:val="32"/>
+          <w:szCs w:val="32"/>
+        </w:rPr>
+      </w:pPr>
+      <w:r>
+        <w:rPr>
+          <w:b/>
+          <w:bCs/>
+          <w:color w:val="D86DCB" w:themeColor="accent5" w:themeTint="99"/>
+          <w:sz w:val="32"/>
+          <w:szCs w:val="32"/>
         </w:rPr>
         <w:t xml:space="preserve">      ...</w:t>
       </w:r>
@@ -1779,17 +1758,17 @@
           <w:b/>
           <w:bCs/>
           <w:color w:val="D86DCB" w:themeColor="accent5" w:themeTint="99"/>
-          <w:sz w:val="36"/>
-          <w:szCs w:val="36"/>
-        </w:rPr>
-      </w:pPr>
-      <w:r>
-        <w:rPr>
-          <w:b/>
-          <w:bCs/>
-          <w:color w:val="D86DCB" w:themeColor="accent5" w:themeTint="99"/>
-          <w:sz w:val="36"/>
-          <w:szCs w:val="36"/>
+          <w:sz w:val="32"/>
+          <w:szCs w:val="32"/>
+        </w:rPr>
+      </w:pPr>
+      <w:r>
+        <w:rPr>
+          <w:b/>
+          <w:bCs/>
+          <w:color w:val="D86DCB" w:themeColor="accent5" w:themeTint="99"/>
+          <w:sz w:val="32"/>
+          <w:szCs w:val="32"/>
         </w:rPr>
         <w:t xml:space="preserve">      throw </w:t>
       </w:r>
@@ -1799,8 +1778,8 @@
           <w:b/>
           <w:bCs/>
           <w:color w:val="D86DCB" w:themeColor="accent5" w:themeTint="99"/>
-          <w:sz w:val="36"/>
-          <w:szCs w:val="36"/>
+          <w:sz w:val="32"/>
+          <w:szCs w:val="32"/>
         </w:rPr>
         <w:t>Exception(</w:t>
       </w:r>
@@ -1810,8 +1789,8 @@
           <w:b/>
           <w:bCs/>
           <w:color w:val="D86DCB" w:themeColor="accent5" w:themeTint="99"/>
-          <w:sz w:val="36"/>
-          <w:szCs w:val="36"/>
+          <w:sz w:val="32"/>
+          <w:szCs w:val="32"/>
         </w:rPr>
         <w:t>'Some arbitrary error');</w:t>
       </w:r>
@@ -1823,17 +1802,17 @@
           <w:b/>
           <w:bCs/>
           <w:color w:val="D86DCB" w:themeColor="accent5" w:themeTint="99"/>
-          <w:sz w:val="36"/>
-          <w:szCs w:val="36"/>
-        </w:rPr>
-      </w:pPr>
-      <w:r>
-        <w:rPr>
-          <w:b/>
-          <w:bCs/>
-          <w:color w:val="D86DCB" w:themeColor="accent5" w:themeTint="99"/>
-          <w:sz w:val="36"/>
-          <w:szCs w:val="36"/>
+          <w:sz w:val="32"/>
+          <w:szCs w:val="32"/>
+        </w:rPr>
+      </w:pPr>
+      <w:r>
+        <w:rPr>
+          <w:b/>
+          <w:bCs/>
+          <w:color w:val="D86DCB" w:themeColor="accent5" w:themeTint="99"/>
+          <w:sz w:val="32"/>
+          <w:szCs w:val="32"/>
         </w:rPr>
         <w:t xml:space="preserve">    })</w:t>
       </w:r>
@@ -1842,17 +1821,17 @@
       <w:pPr>
         <w:jc w:val="both"/>
         <w:rPr>
-          <w:sz w:val="36"/>
-          <w:szCs w:val="36"/>
-        </w:rPr>
-      </w:pPr>
-      <w:r>
-        <w:rPr>
-          <w:b/>
-          <w:bCs/>
-          <w:color w:val="D86DCB" w:themeColor="accent5" w:themeTint="99"/>
-          <w:sz w:val="36"/>
-          <w:szCs w:val="36"/>
+          <w:sz w:val="32"/>
+          <w:szCs w:val="32"/>
+        </w:rPr>
+      </w:pPr>
+      <w:r>
+        <w:rPr>
+          <w:b/>
+          <w:bCs/>
+          <w:color w:val="D86DCB" w:themeColor="accent5" w:themeTint="99"/>
+          <w:sz w:val="32"/>
+          <w:szCs w:val="32"/>
         </w:rPr>
         <w:t xml:space="preserve">    </w:t>
       </w:r>
@@ -1862,8 +1841,8 @@
           <w:b/>
           <w:bCs/>
           <w:color w:val="D86DCB" w:themeColor="accent5" w:themeTint="99"/>
-          <w:sz w:val="36"/>
-          <w:szCs w:val="36"/>
+          <w:sz w:val="32"/>
+          <w:szCs w:val="32"/>
         </w:rPr>
         <w:t>.</w:t>
       </w:r>
@@ -1873,8 +1852,8 @@
           <w:b/>
           <w:bCs/>
           <w:color w:val="D86DCB" w:themeColor="accent5" w:themeTint="99"/>
-          <w:sz w:val="36"/>
-          <w:szCs w:val="36"/>
+          <w:sz w:val="32"/>
+          <w:szCs w:val="32"/>
         </w:rPr>
         <w:t>catchError</w:t>
       </w:r>
@@ -1885,20 +1864,10 @@
           <w:b/>
           <w:bCs/>
           <w:color w:val="D86DCB" w:themeColor="accent5" w:themeTint="99"/>
-          <w:sz w:val="36"/>
-          <w:szCs w:val="36"/>
-        </w:rPr>
-        <w:t>(</w:t>
-      </w:r>
-      <w:r>
-        <w:rPr>
-          <w:b/>
-          <w:bCs/>
-          <w:color w:val="D86DCB" w:themeColor="accent5" w:themeTint="99"/>
-          <w:sz w:val="36"/>
-          <w:szCs w:val="36"/>
-        </w:rPr>
-        <w:t xml:space="preserve"> (e) {</w:t>
+          <w:sz w:val="32"/>
+          <w:szCs w:val="32"/>
+        </w:rPr>
+        <w:t>( (e) {</w:t>
       </w:r>
       <w:proofErr w:type="spellStart"/>
       <w:r>
@@ -1906,8 +1875,8 @@
           <w:b/>
           <w:bCs/>
           <w:color w:val="D86DCB" w:themeColor="accent5" w:themeTint="99"/>
-          <w:sz w:val="36"/>
-          <w:szCs w:val="36"/>
+          <w:sz w:val="32"/>
+          <w:szCs w:val="32"/>
         </w:rPr>
         <w:t>handleError</w:t>
       </w:r>
@@ -1917,92 +1886,82 @@
           <w:b/>
           <w:bCs/>
           <w:color w:val="D86DCB" w:themeColor="accent5" w:themeTint="99"/>
-          <w:sz w:val="36"/>
-          <w:szCs w:val="36"/>
-        </w:rPr>
-        <w:t>}</w:t>
-      </w:r>
-      <w:r>
-        <w:rPr>
-          <w:b/>
-          <w:bCs/>
-          <w:color w:val="D86DCB" w:themeColor="accent5" w:themeTint="99"/>
-          <w:sz w:val="36"/>
-          <w:szCs w:val="36"/>
-        </w:rPr>
-        <w:t>);</w:t>
-      </w:r>
-    </w:p>
-    <w:p>
-      <w:pPr>
-        <w:jc w:val="both"/>
-        <w:rPr>
-          <w:sz w:val="36"/>
-          <w:szCs w:val="36"/>
-        </w:rPr>
-      </w:pPr>
-    </w:p>
-    <w:p>
-      <w:pPr>
-        <w:jc w:val="both"/>
-        <w:rPr>
-          <w:sz w:val="36"/>
-          <w:szCs w:val="36"/>
-        </w:rPr>
-      </w:pPr>
-    </w:p>
-    <w:p>
-      <w:pPr>
-        <w:jc w:val="both"/>
-        <w:rPr>
-          <w:sz w:val="36"/>
-          <w:szCs w:val="36"/>
-        </w:rPr>
-      </w:pPr>
-    </w:p>
-    <w:p>
-      <w:pPr>
-        <w:jc w:val="both"/>
-        <w:rPr>
-          <w:sz w:val="36"/>
-          <w:szCs w:val="36"/>
-        </w:rPr>
-      </w:pPr>
-    </w:p>
-    <w:p>
-      <w:pPr>
-        <w:jc w:val="both"/>
-        <w:rPr>
-          <w:sz w:val="36"/>
-          <w:szCs w:val="36"/>
-        </w:rPr>
-      </w:pPr>
-    </w:p>
-    <w:p>
-      <w:pPr>
-        <w:jc w:val="both"/>
-        <w:rPr>
-          <w:sz w:val="36"/>
-          <w:szCs w:val="36"/>
-        </w:rPr>
-      </w:pPr>
-    </w:p>
-    <w:p>
-      <w:pPr>
-        <w:jc w:val="both"/>
-        <w:rPr>
-          <w:b/>
-          <w:bCs/>
-          <w:sz w:val="36"/>
-          <w:szCs w:val="36"/>
-        </w:rPr>
-      </w:pPr>
-      <w:r>
-        <w:rPr>
-          <w:b/>
-          <w:bCs/>
-          <w:sz w:val="36"/>
-          <w:szCs w:val="36"/>
+          <w:sz w:val="32"/>
+          <w:szCs w:val="32"/>
+        </w:rPr>
+        <w:t>});</w:t>
+      </w:r>
+    </w:p>
+    <w:p>
+      <w:pPr>
+        <w:jc w:val="both"/>
+        <w:rPr>
+          <w:sz w:val="32"/>
+          <w:szCs w:val="32"/>
+        </w:rPr>
+      </w:pPr>
+    </w:p>
+    <w:p>
+      <w:pPr>
+        <w:jc w:val="both"/>
+        <w:rPr>
+          <w:sz w:val="32"/>
+          <w:szCs w:val="32"/>
+        </w:rPr>
+      </w:pPr>
+    </w:p>
+    <w:p>
+      <w:pPr>
+        <w:jc w:val="both"/>
+        <w:rPr>
+          <w:sz w:val="32"/>
+          <w:szCs w:val="32"/>
+        </w:rPr>
+      </w:pPr>
+    </w:p>
+    <w:p>
+      <w:pPr>
+        <w:jc w:val="both"/>
+        <w:rPr>
+          <w:sz w:val="32"/>
+          <w:szCs w:val="32"/>
+        </w:rPr>
+      </w:pPr>
+    </w:p>
+    <w:p>
+      <w:pPr>
+        <w:jc w:val="both"/>
+        <w:rPr>
+          <w:sz w:val="32"/>
+          <w:szCs w:val="32"/>
+        </w:rPr>
+      </w:pPr>
+    </w:p>
+    <w:p>
+      <w:pPr>
+        <w:jc w:val="both"/>
+        <w:rPr>
+          <w:sz w:val="32"/>
+          <w:szCs w:val="32"/>
+        </w:rPr>
+      </w:pPr>
+    </w:p>
+    <w:p>
+      <w:pPr>
+        <w:jc w:val="both"/>
+        <w:rPr>
+          <w:b/>
+          <w:bCs/>
+          <w:sz w:val="32"/>
+          <w:szCs w:val="32"/>
+        </w:rPr>
+      </w:pPr>
+      <w:r>
+        <w:rPr>
+          <w:b/>
+          <w:bCs/>
+          <w:sz w:val="32"/>
+          <w:szCs w:val="32"/>
         </w:rPr>
         <w:t>Dart Pub Cache Cleaning:</w:t>
       </w:r>
@@ -2011,15 +1970,16 @@
       <w:pPr>
         <w:jc w:val="both"/>
         <w:rPr>
-          <w:sz w:val="36"/>
-          <w:szCs w:val="36"/>
-        </w:rPr>
-      </w:pPr>
-      <w:r>
-        <w:rPr>
-          <w:sz w:val="36"/>
-          <w:szCs w:val="36"/>
-        </w:rPr>
+          <w:sz w:val="32"/>
+          <w:szCs w:val="32"/>
+        </w:rPr>
+      </w:pPr>
+      <w:r>
+        <w:rPr>
+          <w:sz w:val="32"/>
+          <w:szCs w:val="32"/>
+        </w:rPr>
+        <w:lastRenderedPageBreak/>
         <w:t># Removes unnecessary packages and frees up disk space on developer machine. For more info see d5 dart new features documentation.</w:t>
       </w:r>
     </w:p>
@@ -2027,27 +1987,27 @@
       <w:pPr>
         <w:jc w:val="both"/>
         <w:rPr>
-          <w:sz w:val="36"/>
-          <w:szCs w:val="36"/>
-        </w:rPr>
-      </w:pPr>
-    </w:p>
-    <w:p>
-      <w:pPr>
-        <w:jc w:val="both"/>
-        <w:rPr>
-          <w:b/>
-          <w:bCs/>
-          <w:sz w:val="36"/>
-          <w:szCs w:val="36"/>
-        </w:rPr>
-      </w:pPr>
-      <w:r>
-        <w:rPr>
-          <w:b/>
-          <w:bCs/>
-          <w:sz w:val="36"/>
-          <w:szCs w:val="36"/>
+          <w:sz w:val="32"/>
+          <w:szCs w:val="32"/>
+        </w:rPr>
+      </w:pPr>
+    </w:p>
+    <w:p>
+      <w:pPr>
+        <w:jc w:val="both"/>
+        <w:rPr>
+          <w:b/>
+          <w:bCs/>
+          <w:sz w:val="32"/>
+          <w:szCs w:val="32"/>
+        </w:rPr>
+      </w:pPr>
+      <w:r>
+        <w:rPr>
+          <w:b/>
+          <w:bCs/>
+          <w:sz w:val="32"/>
+          <w:szCs w:val="32"/>
         </w:rPr>
         <w:t>Dart Type System: var vs dynamic vs Object:</w:t>
       </w:r>
@@ -2079,14 +2039,14 @@
               <w:rPr>
                 <w:b w:val="0"/>
                 <w:bCs w:val="0"/>
-                <w:sz w:val="36"/>
-                <w:szCs w:val="36"/>
+                <w:sz w:val="32"/>
+                <w:szCs w:val="32"/>
               </w:rPr>
             </w:pPr>
             <w:r>
               <w:rPr>
-                <w:sz w:val="36"/>
-                <w:szCs w:val="36"/>
+                <w:sz w:val="32"/>
+                <w:szCs w:val="32"/>
               </w:rPr>
               <w:t>var</w:t>
             </w:r>
@@ -2095,14 +2055,14 @@
             <w:pPr>
               <w:jc w:val="center"/>
               <w:rPr>
-                <w:sz w:val="36"/>
-                <w:szCs w:val="36"/>
+                <w:sz w:val="32"/>
+                <w:szCs w:val="32"/>
               </w:rPr>
             </w:pPr>
             <w:r>
               <w:rPr>
-                <w:sz w:val="36"/>
-                <w:szCs w:val="36"/>
+                <w:sz w:val="32"/>
+                <w:szCs w:val="32"/>
               </w:rPr>
               <w:t>(Inferred &amp; Locked)</w:t>
             </w:r>
@@ -2119,14 +2079,14 @@
               <w:rPr>
                 <w:b w:val="0"/>
                 <w:bCs w:val="0"/>
-                <w:sz w:val="36"/>
-                <w:szCs w:val="36"/>
+                <w:sz w:val="32"/>
+                <w:szCs w:val="32"/>
               </w:rPr>
             </w:pPr>
             <w:r>
               <w:rPr>
-                <w:sz w:val="36"/>
-                <w:szCs w:val="36"/>
+                <w:sz w:val="32"/>
+                <w:szCs w:val="32"/>
               </w:rPr>
               <w:t>dynamic</w:t>
             </w:r>
@@ -2136,14 +2096,14 @@
               <w:jc w:val="center"/>
               <w:cnfStyle w:val="100000000000" w:firstRow="1" w:lastRow="0" w:firstColumn="0" w:lastColumn="0" w:oddVBand="0" w:evenVBand="0" w:oddHBand="0" w:evenHBand="0" w:firstRowFirstColumn="0" w:firstRowLastColumn="0" w:lastRowFirstColumn="0" w:lastRowLastColumn="0"/>
               <w:rPr>
-                <w:sz w:val="36"/>
-                <w:szCs w:val="36"/>
+                <w:sz w:val="32"/>
+                <w:szCs w:val="32"/>
               </w:rPr>
             </w:pPr>
             <w:r>
               <w:rPr>
-                <w:sz w:val="36"/>
-                <w:szCs w:val="36"/>
+                <w:sz w:val="32"/>
+                <w:szCs w:val="32"/>
               </w:rPr>
               <w:t>(Flexible &amp; Risky)</w:t>
             </w:r>
@@ -2160,14 +2120,14 @@
               <w:rPr>
                 <w:b w:val="0"/>
                 <w:bCs w:val="0"/>
-                <w:sz w:val="36"/>
-                <w:szCs w:val="36"/>
+                <w:sz w:val="32"/>
+                <w:szCs w:val="32"/>
               </w:rPr>
             </w:pPr>
             <w:r>
               <w:rPr>
-                <w:sz w:val="36"/>
-                <w:szCs w:val="36"/>
+                <w:sz w:val="32"/>
+                <w:szCs w:val="32"/>
               </w:rPr>
               <w:t>Object</w:t>
             </w:r>
@@ -2177,14 +2137,14 @@
               <w:jc w:val="center"/>
               <w:cnfStyle w:val="100000000000" w:firstRow="1" w:lastRow="0" w:firstColumn="0" w:lastColumn="0" w:oddVBand="0" w:evenVBand="0" w:oddHBand="0" w:evenHBand="0" w:firstRowFirstColumn="0" w:firstRowLastColumn="0" w:lastRowFirstColumn="0" w:lastRowLastColumn="0"/>
               <w:rPr>
-                <w:sz w:val="36"/>
-                <w:szCs w:val="36"/>
+                <w:sz w:val="32"/>
+                <w:szCs w:val="32"/>
               </w:rPr>
             </w:pPr>
             <w:r>
               <w:rPr>
-                <w:sz w:val="36"/>
-                <w:szCs w:val="36"/>
+                <w:sz w:val="32"/>
+                <w:szCs w:val="32"/>
               </w:rPr>
               <w:t>(The Universal Parent)</w:t>
             </w:r>
@@ -2206,36 +2166,18 @@
               <w:rPr>
                 <w:b w:val="0"/>
                 <w:bCs w:val="0"/>
-                <w:sz w:val="36"/>
-                <w:szCs w:val="36"/>
+                <w:sz w:val="32"/>
+                <w:szCs w:val="32"/>
               </w:rPr>
             </w:pPr>
             <w:r>
               <w:rPr>
                 <w:b w:val="0"/>
                 <w:bCs w:val="0"/>
-                <w:sz w:val="36"/>
-                <w:szCs w:val="36"/>
-              </w:rPr>
-              <w:t>Type is determined at compile-time (</w:t>
-            </w:r>
-            <w:r>
-              <w:rPr>
-                <w:b w:val="0"/>
-                <w:bCs w:val="0"/>
-                <w:sz w:val="36"/>
-                <w:szCs w:val="36"/>
-              </w:rPr>
-              <w:t>inferred</w:t>
-            </w:r>
-            <w:r>
-              <w:rPr>
-                <w:b w:val="0"/>
-                <w:bCs w:val="0"/>
-                <w:sz w:val="36"/>
-                <w:szCs w:val="36"/>
-              </w:rPr>
-              <w:t xml:space="preserve"> from value)</w:t>
+                <w:sz w:val="32"/>
+                <w:szCs w:val="32"/>
+              </w:rPr>
+              <w:t>Type is determined at compile-time (inferred from value)</w:t>
             </w:r>
           </w:p>
         </w:tc>
@@ -2248,14 +2190,14 @@
               <w:jc w:val="both"/>
               <w:cnfStyle w:val="000000100000" w:firstRow="0" w:lastRow="0" w:firstColumn="0" w:lastColumn="0" w:oddVBand="0" w:evenVBand="0" w:oddHBand="1" w:evenHBand="0" w:firstRowFirstColumn="0" w:firstRowLastColumn="0" w:lastRowFirstColumn="0" w:lastRowLastColumn="0"/>
               <w:rPr>
-                <w:sz w:val="36"/>
-                <w:szCs w:val="36"/>
+                <w:sz w:val="32"/>
+                <w:szCs w:val="32"/>
               </w:rPr>
             </w:pPr>
             <w:r>
               <w:rPr>
-                <w:sz w:val="36"/>
-                <w:szCs w:val="36"/>
+                <w:sz w:val="32"/>
+                <w:szCs w:val="32"/>
               </w:rPr>
               <w:t>Type is determined at runtime (Can change freely)</w:t>
             </w:r>
@@ -2270,14 +2212,14 @@
               <w:jc w:val="both"/>
               <w:cnfStyle w:val="000000100000" w:firstRow="0" w:lastRow="0" w:firstColumn="0" w:lastColumn="0" w:oddVBand="0" w:evenVBand="0" w:oddHBand="1" w:evenHBand="0" w:firstRowFirstColumn="0" w:firstRowLastColumn="0" w:lastRowFirstColumn="0" w:lastRowLastColumn="0"/>
               <w:rPr>
-                <w:sz w:val="36"/>
-                <w:szCs w:val="36"/>
+                <w:sz w:val="32"/>
+                <w:szCs w:val="32"/>
               </w:rPr>
             </w:pPr>
             <w:r>
               <w:rPr>
-                <w:sz w:val="36"/>
-                <w:szCs w:val="36"/>
+                <w:sz w:val="32"/>
+                <w:szCs w:val="32"/>
               </w:rPr>
               <w:t xml:space="preserve"> Type is determined at compile time (as generic ‘Object’)</w:t>
             </w:r>
@@ -2297,16 +2239,16 @@
                 <w:b w:val="0"/>
                 <w:bCs w:val="0"/>
                 <w:color w:val="D86DCB" w:themeColor="accent5" w:themeTint="99"/>
-                <w:sz w:val="36"/>
-                <w:szCs w:val="36"/>
+                <w:sz w:val="32"/>
+                <w:szCs w:val="32"/>
               </w:rPr>
             </w:pPr>
             <w:proofErr w:type="gramStart"/>
             <w:r>
               <w:rPr>
                 <w:color w:val="D86DCB" w:themeColor="accent5" w:themeTint="99"/>
-                <w:sz w:val="36"/>
-                <w:szCs w:val="36"/>
+                <w:sz w:val="32"/>
+                <w:szCs w:val="32"/>
               </w:rPr>
               <w:t>var  x</w:t>
             </w:r>
@@ -2314,8 +2256,8 @@
             <w:r>
               <w:rPr>
                 <w:color w:val="D86DCB" w:themeColor="accent5" w:themeTint="99"/>
-                <w:sz w:val="36"/>
-                <w:szCs w:val="36"/>
+                <w:sz w:val="32"/>
+                <w:szCs w:val="32"/>
               </w:rPr>
               <w:t xml:space="preserve">  =  ‘Hi’;</w:t>
             </w:r>
@@ -2327,16 +2269,16 @@
                 <w:b w:val="0"/>
                 <w:bCs w:val="0"/>
                 <w:color w:val="D86DCB" w:themeColor="accent5" w:themeTint="99"/>
-                <w:sz w:val="36"/>
-                <w:szCs w:val="36"/>
+                <w:sz w:val="32"/>
+                <w:szCs w:val="32"/>
               </w:rPr>
             </w:pPr>
             <w:proofErr w:type="gramStart"/>
             <w:r>
               <w:rPr>
                 <w:color w:val="D86DCB" w:themeColor="accent5" w:themeTint="99"/>
-                <w:sz w:val="36"/>
-                <w:szCs w:val="36"/>
+                <w:sz w:val="32"/>
+                <w:szCs w:val="32"/>
               </w:rPr>
               <w:t>x  =</w:t>
             </w:r>
@@ -2344,8 +2286,8 @@
             <w:r>
               <w:rPr>
                 <w:color w:val="D86DCB" w:themeColor="accent5" w:themeTint="99"/>
-                <w:sz w:val="36"/>
-                <w:szCs w:val="36"/>
+                <w:sz w:val="32"/>
+                <w:szCs w:val="32"/>
               </w:rPr>
               <w:t xml:space="preserve">  123;</w:t>
             </w:r>
@@ -2358,16 +2300,16 @@
                 <w:b w:val="0"/>
                 <w:bCs w:val="0"/>
                 <w:color w:val="D86DCB" w:themeColor="accent5" w:themeTint="99"/>
-                <w:sz w:val="36"/>
-                <w:szCs w:val="36"/>
+                <w:sz w:val="32"/>
+                <w:szCs w:val="32"/>
               </w:rPr>
             </w:pPr>
             <w:r>
               <w:rPr>
                 <w:rFonts w:ascii="Segoe UI Emoji" w:hAnsi="Segoe UI Emoji" w:cs="Segoe UI Emoji"/>
                 <w:color w:val="D86DCB" w:themeColor="accent5" w:themeTint="99"/>
-                <w:sz w:val="36"/>
-                <w:szCs w:val="36"/>
+                <w:sz w:val="32"/>
+                <w:szCs w:val="32"/>
               </w:rPr>
               <w:t>❌</w:t>
             </w:r>
@@ -2375,8 +2317,8 @@
               <w:rPr>
                 <w:rFonts w:cs="Segoe UI Emoji"/>
                 <w:color w:val="D86DCB" w:themeColor="accent5" w:themeTint="99"/>
-                <w:sz w:val="36"/>
-                <w:szCs w:val="36"/>
+                <w:sz w:val="32"/>
+                <w:szCs w:val="32"/>
               </w:rPr>
               <w:t>Error</w:t>
             </w:r>
@@ -2387,27 +2329,18 @@
               <w:rPr>
                 <w:b w:val="0"/>
                 <w:bCs w:val="0"/>
-                <w:sz w:val="36"/>
-                <w:szCs w:val="36"/>
+                <w:sz w:val="32"/>
+                <w:szCs w:val="32"/>
               </w:rPr>
             </w:pPr>
             <w:r>
               <w:rPr>
                 <w:b w:val="0"/>
                 <w:bCs w:val="0"/>
-                <w:sz w:val="36"/>
-                <w:szCs w:val="36"/>
-              </w:rPr>
-              <w:t>Safe bec</w:t>
-            </w:r>
-            <w:r>
-              <w:rPr>
-                <w:b w:val="0"/>
-                <w:bCs w:val="0"/>
-                <w:sz w:val="36"/>
-                <w:szCs w:val="36"/>
-              </w:rPr>
-              <w:t>ause type is locked. Full compile-time checks.</w:t>
+                <w:sz w:val="32"/>
+                <w:szCs w:val="32"/>
+              </w:rPr>
+              <w:t>Safe because type is locked. Full compile-time checks.</w:t>
             </w:r>
           </w:p>
         </w:tc>
@@ -2423,8 +2356,8 @@
                 <w:b/>
                 <w:bCs/>
                 <w:color w:val="D86DCB" w:themeColor="accent5" w:themeTint="99"/>
-                <w:sz w:val="36"/>
-                <w:szCs w:val="36"/>
+                <w:sz w:val="32"/>
+                <w:szCs w:val="32"/>
               </w:rPr>
             </w:pPr>
             <w:proofErr w:type="gramStart"/>
@@ -2433,8 +2366,8 @@
                 <w:b/>
                 <w:bCs/>
                 <w:color w:val="D86DCB" w:themeColor="accent5" w:themeTint="99"/>
-                <w:sz w:val="36"/>
-                <w:szCs w:val="36"/>
+                <w:sz w:val="32"/>
+                <w:szCs w:val="32"/>
               </w:rPr>
               <w:t>var  y</w:t>
             </w:r>
@@ -2444,8 +2377,8 @@
                 <w:b/>
                 <w:bCs/>
                 <w:color w:val="D86DCB" w:themeColor="accent5" w:themeTint="99"/>
-                <w:sz w:val="36"/>
-                <w:szCs w:val="36"/>
+                <w:sz w:val="32"/>
+                <w:szCs w:val="32"/>
               </w:rPr>
               <w:t xml:space="preserve">  =  ‘Hi’;</w:t>
             </w:r>
@@ -2458,8 +2391,8 @@
                 <w:b/>
                 <w:bCs/>
                 <w:color w:val="D86DCB" w:themeColor="accent5" w:themeTint="99"/>
-                <w:sz w:val="36"/>
-                <w:szCs w:val="36"/>
+                <w:sz w:val="32"/>
+                <w:szCs w:val="32"/>
               </w:rPr>
             </w:pPr>
             <w:proofErr w:type="gramStart"/>
@@ -2468,8 +2401,8 @@
                 <w:b/>
                 <w:bCs/>
                 <w:color w:val="D86DCB" w:themeColor="accent5" w:themeTint="99"/>
-                <w:sz w:val="36"/>
-                <w:szCs w:val="36"/>
+                <w:sz w:val="32"/>
+                <w:szCs w:val="32"/>
               </w:rPr>
               <w:t>y  =</w:t>
             </w:r>
@@ -2479,8 +2412,8 @@
                 <w:b/>
                 <w:bCs/>
                 <w:color w:val="D86DCB" w:themeColor="accent5" w:themeTint="99"/>
-                <w:sz w:val="36"/>
-                <w:szCs w:val="36"/>
+                <w:sz w:val="32"/>
+                <w:szCs w:val="32"/>
               </w:rPr>
               <w:t xml:space="preserve">  123; </w:t>
             </w:r>
@@ -2490,8 +2423,8 @@
                 <w:b/>
                 <w:bCs/>
                 <w:color w:val="D86DCB" w:themeColor="accent5" w:themeTint="99"/>
-                <w:sz w:val="36"/>
-                <w:szCs w:val="36"/>
+                <w:sz w:val="32"/>
+                <w:szCs w:val="32"/>
               </w:rPr>
               <w:t>✅</w:t>
             </w:r>
@@ -2500,8 +2433,8 @@
                 <w:b/>
                 <w:bCs/>
                 <w:color w:val="D86DCB" w:themeColor="accent5" w:themeTint="99"/>
-                <w:sz w:val="36"/>
-                <w:szCs w:val="36"/>
+                <w:sz w:val="32"/>
+                <w:szCs w:val="32"/>
               </w:rPr>
               <w:t>OK</w:t>
             </w:r>
@@ -2514,8 +2447,8 @@
                 <w:b/>
                 <w:bCs/>
                 <w:color w:val="D86DCB" w:themeColor="accent5" w:themeTint="99"/>
-                <w:sz w:val="36"/>
-                <w:szCs w:val="36"/>
+                <w:sz w:val="32"/>
+                <w:szCs w:val="32"/>
               </w:rPr>
             </w:pPr>
             <w:proofErr w:type="spellStart"/>
@@ -2525,8 +2458,8 @@
                 <w:b/>
                 <w:bCs/>
                 <w:color w:val="D86DCB" w:themeColor="accent5" w:themeTint="99"/>
-                <w:sz w:val="36"/>
-                <w:szCs w:val="36"/>
+                <w:sz w:val="32"/>
+                <w:szCs w:val="32"/>
               </w:rPr>
               <w:t>y.fool</w:t>
             </w:r>
@@ -2537,8 +2470,8 @@
                 <w:b/>
                 <w:bCs/>
                 <w:color w:val="D86DCB" w:themeColor="accent5" w:themeTint="99"/>
-                <w:sz w:val="36"/>
-                <w:szCs w:val="36"/>
+                <w:sz w:val="32"/>
+                <w:szCs w:val="32"/>
               </w:rPr>
               <w:t xml:space="preserve">(); </w:t>
             </w:r>
@@ -2553,8 +2486,8 @@
                 <w:b/>
                 <w:bCs/>
                 <w:color w:val="D86DCB" w:themeColor="accent5" w:themeTint="99"/>
-                <w:sz w:val="36"/>
-                <w:szCs w:val="36"/>
+                <w:sz w:val="32"/>
+                <w:szCs w:val="32"/>
               </w:rPr>
               <mc:AlternateContent>
                 <mc:Choice Requires="w16se">
@@ -2570,8 +2503,8 @@
                 <w:b/>
                 <w:bCs/>
                 <w:color w:val="D86DCB" w:themeColor="accent5" w:themeTint="99"/>
-                <w:sz w:val="36"/>
-                <w:szCs w:val="36"/>
+                <w:sz w:val="32"/>
+                <w:szCs w:val="32"/>
               </w:rPr>
               <w:t>Crash</w:t>
             </w:r>
@@ -2581,14 +2514,14 @@
               <w:jc w:val="both"/>
               <w:cnfStyle w:val="000000000000" w:firstRow="0" w:lastRow="0" w:firstColumn="0" w:lastColumn="0" w:oddVBand="0" w:evenVBand="0" w:oddHBand="0" w:evenHBand="0" w:firstRowFirstColumn="0" w:firstRowLastColumn="0" w:lastRowFirstColumn="0" w:lastRowLastColumn="0"/>
               <w:rPr>
-                <w:sz w:val="36"/>
-                <w:szCs w:val="36"/>
+                <w:sz w:val="32"/>
+                <w:szCs w:val="32"/>
               </w:rPr>
             </w:pPr>
             <w:r>
               <w:rPr>
-                <w:sz w:val="36"/>
-                <w:szCs w:val="36"/>
+                <w:sz w:val="32"/>
+                <w:szCs w:val="32"/>
               </w:rPr>
               <w:t>Not safe because run-time errors can happen</w:t>
             </w:r>
@@ -2598,8 +2531,8 @@
               <w:jc w:val="both"/>
               <w:cnfStyle w:val="000000000000" w:firstRow="0" w:lastRow="0" w:firstColumn="0" w:lastColumn="0" w:oddVBand="0" w:evenVBand="0" w:oddHBand="0" w:evenHBand="0" w:firstRowFirstColumn="0" w:firstRowLastColumn="0" w:lastRowFirstColumn="0" w:lastRowLastColumn="0"/>
               <w:rPr>
-                <w:sz w:val="36"/>
-                <w:szCs w:val="36"/>
+                <w:sz w:val="32"/>
+                <w:szCs w:val="32"/>
               </w:rPr>
             </w:pPr>
           </w:p>
@@ -2616,8 +2549,8 @@
                 <w:b/>
                 <w:bCs/>
                 <w:color w:val="D86DCB" w:themeColor="accent5" w:themeTint="99"/>
-                <w:sz w:val="36"/>
-                <w:szCs w:val="36"/>
+                <w:sz w:val="32"/>
+                <w:szCs w:val="32"/>
               </w:rPr>
             </w:pPr>
             <w:proofErr w:type="gramStart"/>
@@ -2626,8 +2559,8 @@
                 <w:b/>
                 <w:bCs/>
                 <w:color w:val="D86DCB" w:themeColor="accent5" w:themeTint="99"/>
-                <w:sz w:val="36"/>
-                <w:szCs w:val="36"/>
+                <w:sz w:val="32"/>
+                <w:szCs w:val="32"/>
               </w:rPr>
               <w:t>Object  z</w:t>
             </w:r>
@@ -2637,8 +2570,8 @@
                 <w:b/>
                 <w:bCs/>
                 <w:color w:val="D86DCB" w:themeColor="accent5" w:themeTint="99"/>
-                <w:sz w:val="36"/>
-                <w:szCs w:val="36"/>
+                <w:sz w:val="32"/>
+                <w:szCs w:val="32"/>
               </w:rPr>
               <w:t xml:space="preserve">  =   ‘Hi’;</w:t>
             </w:r>
@@ -2651,8 +2584,8 @@
                 <w:b/>
                 <w:bCs/>
                 <w:color w:val="D86DCB" w:themeColor="accent5" w:themeTint="99"/>
-                <w:sz w:val="36"/>
-                <w:szCs w:val="36"/>
+                <w:sz w:val="32"/>
+                <w:szCs w:val="32"/>
               </w:rPr>
             </w:pPr>
             <w:proofErr w:type="spellStart"/>
@@ -2662,8 +2595,8 @@
                 <w:b/>
                 <w:bCs/>
                 <w:color w:val="D86DCB" w:themeColor="accent5" w:themeTint="99"/>
-                <w:sz w:val="36"/>
-                <w:szCs w:val="36"/>
+                <w:sz w:val="32"/>
+                <w:szCs w:val="32"/>
               </w:rPr>
               <w:t>z.toUpperCase</w:t>
             </w:r>
@@ -2674,8 +2607,8 @@
                 <w:b/>
                 <w:bCs/>
                 <w:color w:val="D86DCB" w:themeColor="accent5" w:themeTint="99"/>
-                <w:sz w:val="36"/>
-                <w:szCs w:val="36"/>
+                <w:sz w:val="32"/>
+                <w:szCs w:val="32"/>
               </w:rPr>
               <w:t>();</w:t>
             </w:r>
@@ -2689,8 +2622,8 @@
                 <w:b/>
                 <w:bCs/>
                 <w:color w:val="D86DCB" w:themeColor="accent5" w:themeTint="99"/>
-                <w:sz w:val="36"/>
-                <w:szCs w:val="36"/>
+                <w:sz w:val="32"/>
+                <w:szCs w:val="32"/>
               </w:rPr>
             </w:pPr>
             <w:r>
@@ -2699,8 +2632,8 @@
                 <w:b/>
                 <w:bCs/>
                 <w:color w:val="D86DCB" w:themeColor="accent5" w:themeTint="99"/>
-                <w:sz w:val="36"/>
-                <w:szCs w:val="36"/>
+                <w:sz w:val="32"/>
+                <w:szCs w:val="32"/>
               </w:rPr>
               <w:t>❌</w:t>
             </w:r>
@@ -2710,8 +2643,8 @@
                 <w:b/>
                 <w:bCs/>
                 <w:color w:val="D86DCB" w:themeColor="accent5" w:themeTint="99"/>
-                <w:sz w:val="36"/>
-                <w:szCs w:val="36"/>
+                <w:sz w:val="32"/>
+                <w:szCs w:val="32"/>
               </w:rPr>
               <w:t>Error</w:t>
             </w:r>
@@ -2721,14 +2654,14 @@
               <w:jc w:val="both"/>
               <w:cnfStyle w:val="000000000000" w:firstRow="0" w:lastRow="0" w:firstColumn="0" w:lastColumn="0" w:oddVBand="0" w:evenVBand="0" w:oddHBand="0" w:evenHBand="0" w:firstRowFirstColumn="0" w:firstRowLastColumn="0" w:lastRowFirstColumn="0" w:lastRowLastColumn="0"/>
               <w:rPr>
-                <w:sz w:val="36"/>
-                <w:szCs w:val="36"/>
+                <w:sz w:val="32"/>
+                <w:szCs w:val="32"/>
               </w:rPr>
             </w:pPr>
             <w:r>
               <w:rPr>
-                <w:sz w:val="36"/>
-                <w:szCs w:val="36"/>
+                <w:sz w:val="32"/>
+                <w:szCs w:val="32"/>
               </w:rPr>
               <w:t>Type-safe, but access is limited</w:t>
             </w:r>
@@ -2738,8 +2671,8 @@
               <w:jc w:val="both"/>
               <w:cnfStyle w:val="000000000000" w:firstRow="0" w:lastRow="0" w:firstColumn="0" w:lastColumn="0" w:oddVBand="0" w:evenVBand="0" w:oddHBand="0" w:evenHBand="0" w:firstRowFirstColumn="0" w:firstRowLastColumn="0" w:lastRowFirstColumn="0" w:lastRowLastColumn="0"/>
               <w:rPr>
-                <w:sz w:val="36"/>
-                <w:szCs w:val="36"/>
+                <w:sz w:val="32"/>
+                <w:szCs w:val="32"/>
               </w:rPr>
             </w:pPr>
           </w:p>
@@ -2760,14 +2693,14 @@
               <w:rPr>
                 <w:b w:val="0"/>
                 <w:bCs w:val="0"/>
-                <w:sz w:val="36"/>
-                <w:szCs w:val="36"/>
+                <w:sz w:val="32"/>
+                <w:szCs w:val="32"/>
               </w:rPr>
             </w:pPr>
             <w:r>
               <w:rPr>
-                <w:sz w:val="36"/>
-                <w:szCs w:val="36"/>
+                <w:sz w:val="32"/>
+                <w:szCs w:val="32"/>
               </w:rPr>
               <w:t>Usage:</w:t>
             </w:r>
@@ -2775,8 +2708,8 @@
               <w:rPr>
                 <w:b w:val="0"/>
                 <w:bCs w:val="0"/>
-                <w:sz w:val="36"/>
-                <w:szCs w:val="36"/>
+                <w:sz w:val="32"/>
+                <w:szCs w:val="32"/>
               </w:rPr>
               <w:t xml:space="preserve"> Direct, safe access to methods</w:t>
             </w:r>
@@ -2790,23 +2723,23 @@
             <w:pPr>
               <w:cnfStyle w:val="000000100000" w:firstRow="0" w:lastRow="0" w:firstColumn="0" w:lastColumn="0" w:oddVBand="0" w:evenVBand="0" w:oddHBand="1" w:evenHBand="0" w:firstRowFirstColumn="0" w:firstRowLastColumn="0" w:lastRowFirstColumn="0" w:lastRowLastColumn="0"/>
               <w:rPr>
-                <w:sz w:val="36"/>
-                <w:szCs w:val="36"/>
+                <w:sz w:val="32"/>
+                <w:szCs w:val="32"/>
               </w:rPr>
             </w:pPr>
             <w:r>
               <w:rPr>
                 <w:b/>
                 <w:bCs/>
-                <w:sz w:val="36"/>
-                <w:szCs w:val="36"/>
+                <w:sz w:val="32"/>
+                <w:szCs w:val="32"/>
               </w:rPr>
               <w:t xml:space="preserve">Usage: </w:t>
             </w:r>
             <w:r>
               <w:rPr>
-                <w:sz w:val="36"/>
-                <w:szCs w:val="36"/>
+                <w:sz w:val="32"/>
+                <w:szCs w:val="32"/>
               </w:rPr>
               <w:t>‘Wild’ access. No compiler help</w:t>
             </w:r>
@@ -2821,23 +2754,23 @@
               <w:jc w:val="both"/>
               <w:cnfStyle w:val="000000100000" w:firstRow="0" w:lastRow="0" w:firstColumn="0" w:lastColumn="0" w:oddVBand="0" w:evenVBand="0" w:oddHBand="1" w:evenHBand="0" w:firstRowFirstColumn="0" w:firstRowLastColumn="0" w:lastRowFirstColumn="0" w:lastRowLastColumn="0"/>
               <w:rPr>
-                <w:sz w:val="36"/>
-                <w:szCs w:val="36"/>
+                <w:sz w:val="32"/>
+                <w:szCs w:val="32"/>
               </w:rPr>
             </w:pPr>
             <w:r>
               <w:rPr>
                 <w:b/>
                 <w:bCs/>
-                <w:sz w:val="36"/>
-                <w:szCs w:val="36"/>
+                <w:sz w:val="32"/>
+                <w:szCs w:val="32"/>
               </w:rPr>
               <w:t>Usage:</w:t>
             </w:r>
             <w:r>
               <w:rPr>
-                <w:sz w:val="36"/>
-                <w:szCs w:val="36"/>
+                <w:sz w:val="32"/>
+                <w:szCs w:val="32"/>
               </w:rPr>
               <w:t xml:space="preserve"> Must CAST (e.g., ‘as String’) to use specific methods</w:t>
             </w:r>
@@ -2849,33 +2782,32 @@
       <w:pPr>
         <w:jc w:val="both"/>
         <w:rPr>
-          <w:sz w:val="36"/>
-          <w:szCs w:val="36"/>
-        </w:rPr>
-      </w:pPr>
-    </w:p>
-    <w:p>
-      <w:pPr>
-        <w:jc w:val="both"/>
-        <w:rPr>
-          <w:sz w:val="36"/>
-          <w:szCs w:val="36"/>
-        </w:rPr>
-      </w:pPr>
-      <w:r>
-        <w:rPr>
-          <w:b/>
-          <w:bCs/>
-          <w:sz w:val="36"/>
-          <w:szCs w:val="36"/>
-        </w:rPr>
-        <w:lastRenderedPageBreak/>
+          <w:sz w:val="32"/>
+          <w:szCs w:val="32"/>
+        </w:rPr>
+      </w:pPr>
+    </w:p>
+    <w:p>
+      <w:pPr>
+        <w:jc w:val="both"/>
+        <w:rPr>
+          <w:sz w:val="32"/>
+          <w:szCs w:val="32"/>
+        </w:rPr>
+      </w:pPr>
+      <w:r>
+        <w:rPr>
+          <w:b/>
+          <w:bCs/>
+          <w:sz w:val="32"/>
+          <w:szCs w:val="32"/>
+        </w:rPr>
         <w:t xml:space="preserve">Pro-tip: </w:t>
       </w:r>
       <w:r>
         <w:rPr>
-          <w:sz w:val="36"/>
-          <w:szCs w:val="36"/>
+          <w:sz w:val="32"/>
+          <w:szCs w:val="32"/>
         </w:rPr>
         <w:t>Prefer ‘</w:t>
       </w:r>
@@ -2883,15 +2815,15 @@
         <w:rPr>
           <w:b/>
           <w:bCs/>
-          <w:sz w:val="36"/>
-          <w:szCs w:val="36"/>
+          <w:sz w:val="32"/>
+          <w:szCs w:val="32"/>
         </w:rPr>
         <w:t>var</w:t>
       </w:r>
       <w:r>
         <w:rPr>
-          <w:sz w:val="36"/>
-          <w:szCs w:val="36"/>
+          <w:sz w:val="32"/>
+          <w:szCs w:val="32"/>
         </w:rPr>
         <w:t>’ for locals. Use ‘</w:t>
       </w:r>
@@ -2899,15 +2831,15 @@
         <w:rPr>
           <w:b/>
           <w:bCs/>
-          <w:sz w:val="36"/>
-          <w:szCs w:val="36"/>
+          <w:sz w:val="32"/>
+          <w:szCs w:val="32"/>
         </w:rPr>
         <w:t>Object</w:t>
       </w:r>
       <w:r>
         <w:rPr>
-          <w:sz w:val="36"/>
-          <w:szCs w:val="36"/>
+          <w:sz w:val="32"/>
+          <w:szCs w:val="32"/>
         </w:rPr>
         <w:t>’ for unknown data. Avoid ‘</w:t>
       </w:r>
@@ -2915,15 +2847,15 @@
         <w:rPr>
           <w:b/>
           <w:bCs/>
-          <w:sz w:val="36"/>
-          <w:szCs w:val="36"/>
+          <w:sz w:val="32"/>
+          <w:szCs w:val="32"/>
         </w:rPr>
         <w:t>dynamic</w:t>
       </w:r>
       <w:r>
         <w:rPr>
-          <w:sz w:val="36"/>
-          <w:szCs w:val="36"/>
+          <w:sz w:val="32"/>
+          <w:szCs w:val="32"/>
         </w:rPr>
         <w:t>’ to prevent runtime crashes.</w:t>
       </w:r>
@@ -2932,8 +2864,8 @@
       <w:pPr>
         <w:jc w:val="both"/>
         <w:rPr>
-          <w:sz w:val="36"/>
-          <w:szCs w:val="36"/>
+          <w:sz w:val="32"/>
+          <w:szCs w:val="32"/>
         </w:rPr>
       </w:pPr>
     </w:p>
@@ -3903,7 +3835,6 @@
   <w:style w:type="character" w:default="1" w:styleId="DefaultParagraphFont">
     <w:name w:val="Default Paragraph Font"/>
     <w:uiPriority w:val="1"/>
-    <w:semiHidden/>
     <w:unhideWhenUsed/>
   </w:style>
   <w:style w:type="table" w:default="1" w:styleId="TableNormal">

</xml_diff>

<commit_message>
updated docs, added abstract interface and bash 26th July
</commit_message>
<xml_diff>
--- a/d7_part2_of_dart_extras.docx
+++ b/d7_part2_of_dart_extras.docx
@@ -156,6 +156,758 @@
           <w:szCs w:val="32"/>
         </w:rPr>
       </w:pPr>
+      <w:r>
+        <w:rPr>
+          <w:b/>
+          <w:bCs/>
+          <w:sz w:val="32"/>
+          <w:szCs w:val="32"/>
+        </w:rPr>
+        <w:t>Dart (Super Language):</w:t>
+      </w:r>
+    </w:p>
+    <w:p>
+      <w:pPr>
+        <w:jc w:val="both"/>
+        <w:rPr>
+          <w:sz w:val="32"/>
+          <w:szCs w:val="32"/>
+        </w:rPr>
+      </w:pPr>
+      <w:r>
+        <w:rPr>
+          <w:sz w:val="32"/>
+          <w:szCs w:val="32"/>
+        </w:rPr>
+        <w:t xml:space="preserve"># It’s a type safe general purpose programming language. It was intended to be an alternative to </w:t>
+      </w:r>
+      <w:r>
+        <w:rPr>
+          <w:b/>
+          <w:bCs/>
+          <w:sz w:val="32"/>
+          <w:szCs w:val="32"/>
+        </w:rPr>
+        <w:t>JavaScript</w:t>
+      </w:r>
+      <w:r>
+        <w:rPr>
+          <w:sz w:val="32"/>
+          <w:szCs w:val="32"/>
+        </w:rPr>
+        <w:t xml:space="preserve"> by shipping its own virtual machine (</w:t>
+      </w:r>
+      <w:r>
+        <w:rPr>
+          <w:b/>
+          <w:bCs/>
+          <w:sz w:val="32"/>
+          <w:szCs w:val="32"/>
+        </w:rPr>
+        <w:t>Dart VM</w:t>
+      </w:r>
+      <w:r>
+        <w:rPr>
+          <w:sz w:val="32"/>
+          <w:szCs w:val="32"/>
+        </w:rPr>
+        <w:t>) to run apps in the browser.</w:t>
+      </w:r>
+    </w:p>
+    <w:p>
+      <w:pPr>
+        <w:jc w:val="both"/>
+        <w:rPr>
+          <w:sz w:val="32"/>
+          <w:szCs w:val="32"/>
+        </w:rPr>
+      </w:pPr>
+      <w:r>
+        <w:rPr>
+          <w:sz w:val="32"/>
+          <w:szCs w:val="32"/>
+        </w:rPr>
+        <w:t># It can compile to multiple targets like:</w:t>
+      </w:r>
+    </w:p>
+    <w:p>
+      <w:pPr>
+        <w:pStyle w:val="ListParagraph"/>
+        <w:numPr>
+          <w:ilvl w:val="0"/>
+          <w:numId w:val="4"/>
+        </w:numPr>
+        <w:jc w:val="both"/>
+        <w:rPr>
+          <w:sz w:val="32"/>
+          <w:szCs w:val="32"/>
+        </w:rPr>
+      </w:pPr>
+      <w:r>
+        <w:rPr>
+          <w:sz w:val="32"/>
+          <w:szCs w:val="32"/>
+        </w:rPr>
+        <w:t>Native ARM64 machine code (For android and iOS)</w:t>
+      </w:r>
+    </w:p>
+    <w:p>
+      <w:pPr>
+        <w:pStyle w:val="ListParagraph"/>
+        <w:numPr>
+          <w:ilvl w:val="0"/>
+          <w:numId w:val="4"/>
+        </w:numPr>
+        <w:jc w:val="both"/>
+        <w:rPr>
+          <w:sz w:val="32"/>
+          <w:szCs w:val="32"/>
+        </w:rPr>
+      </w:pPr>
+      <w:r>
+        <w:rPr>
+          <w:b/>
+          <w:bCs/>
+          <w:sz w:val="32"/>
+          <w:szCs w:val="32"/>
+        </w:rPr>
+        <w:t>JavaScript</w:t>
+      </w:r>
+      <w:r>
+        <w:rPr>
+          <w:sz w:val="32"/>
+          <w:szCs w:val="32"/>
+        </w:rPr>
+        <w:t xml:space="preserve"> (</w:t>
+      </w:r>
+      <w:r>
+        <w:rPr>
+          <w:b/>
+          <w:bCs/>
+          <w:sz w:val="32"/>
+          <w:szCs w:val="32"/>
+        </w:rPr>
+        <w:t>Dart2JS</w:t>
+      </w:r>
+      <w:r>
+        <w:rPr>
+          <w:sz w:val="32"/>
+          <w:szCs w:val="32"/>
+        </w:rPr>
+        <w:t xml:space="preserve"> compiler converts </w:t>
+      </w:r>
+      <w:r>
+        <w:rPr>
+          <w:b/>
+          <w:bCs/>
+          <w:sz w:val="32"/>
+          <w:szCs w:val="32"/>
+        </w:rPr>
+        <w:t>Dart</w:t>
+      </w:r>
+      <w:r>
+        <w:rPr>
+          <w:b/>
+          <w:bCs/>
+          <w:sz w:val="32"/>
+          <w:szCs w:val="32"/>
+        </w:rPr>
+        <w:t xml:space="preserve"> </w:t>
+      </w:r>
+      <w:r>
+        <w:rPr>
+          <w:sz w:val="32"/>
+          <w:szCs w:val="32"/>
+        </w:rPr>
+        <w:t xml:space="preserve">code </w:t>
+      </w:r>
+      <w:r>
+        <w:rPr>
+          <w:sz w:val="32"/>
+          <w:szCs w:val="32"/>
+        </w:rPr>
+        <w:sym w:font="Wingdings" w:char="F0E0"/>
+      </w:r>
+      <w:r>
+        <w:rPr>
+          <w:b/>
+          <w:bCs/>
+          <w:sz w:val="32"/>
+          <w:szCs w:val="32"/>
+        </w:rPr>
+        <w:t xml:space="preserve"> JS</w:t>
+      </w:r>
+      <w:r>
+        <w:rPr>
+          <w:b/>
+          <w:bCs/>
+          <w:sz w:val="32"/>
+          <w:szCs w:val="32"/>
+        </w:rPr>
+        <w:t xml:space="preserve"> </w:t>
+      </w:r>
+      <w:r>
+        <w:rPr>
+          <w:sz w:val="32"/>
+          <w:szCs w:val="32"/>
+        </w:rPr>
+        <w:t>code</w:t>
+      </w:r>
+      <w:r>
+        <w:rPr>
+          <w:sz w:val="32"/>
+          <w:szCs w:val="32"/>
+        </w:rPr>
+        <w:t>) for web browsers</w:t>
+      </w:r>
+    </w:p>
+    <w:p>
+      <w:pPr>
+        <w:pStyle w:val="ListParagraph"/>
+        <w:numPr>
+          <w:ilvl w:val="0"/>
+          <w:numId w:val="4"/>
+        </w:numPr>
+        <w:jc w:val="both"/>
+        <w:rPr>
+          <w:sz w:val="32"/>
+          <w:szCs w:val="32"/>
+        </w:rPr>
+      </w:pPr>
+      <w:r>
+        <w:rPr>
+          <w:sz w:val="32"/>
+          <w:szCs w:val="32"/>
+        </w:rPr>
+        <w:t>And</w:t>
+      </w:r>
+      <w:r>
+        <w:rPr>
+          <w:b/>
+          <w:bCs/>
+          <w:sz w:val="32"/>
+          <w:szCs w:val="32"/>
+        </w:rPr>
+        <w:t xml:space="preserve"> X86_64</w:t>
+      </w:r>
+      <w:r>
+        <w:rPr>
+          <w:sz w:val="32"/>
+          <w:szCs w:val="32"/>
+        </w:rPr>
+        <w:t xml:space="preserve"> (self-contained executables for Windows, Mac OS and Linux)</w:t>
+      </w:r>
+    </w:p>
+    <w:p>
+      <w:pPr>
+        <w:jc w:val="both"/>
+        <w:rPr>
+          <w:sz w:val="32"/>
+          <w:szCs w:val="32"/>
+        </w:rPr>
+      </w:pPr>
+    </w:p>
+    <w:p>
+      <w:pPr>
+        <w:jc w:val="both"/>
+        <w:rPr>
+          <w:sz w:val="32"/>
+          <w:szCs w:val="32"/>
+        </w:rPr>
+      </w:pPr>
+      <w:r>
+        <w:rPr>
+          <w:sz w:val="32"/>
+          <w:szCs w:val="32"/>
+        </w:rPr>
+        <w:t>Compiler:</w:t>
+      </w:r>
+    </w:p>
+    <w:p>
+      <w:pPr>
+        <w:jc w:val="both"/>
+        <w:rPr>
+          <w:sz w:val="32"/>
+          <w:szCs w:val="32"/>
+        </w:rPr>
+      </w:pPr>
+      <w:r>
+        <w:rPr>
+          <w:sz w:val="32"/>
+          <w:szCs w:val="32"/>
+        </w:rPr>
+        <w:t xml:space="preserve"># </w:t>
+      </w:r>
+      <w:r>
+        <w:rPr>
+          <w:b/>
+          <w:bCs/>
+          <w:sz w:val="32"/>
+          <w:szCs w:val="32"/>
+        </w:rPr>
+        <w:t>Dart</w:t>
+      </w:r>
+      <w:r>
+        <w:rPr>
+          <w:sz w:val="32"/>
+          <w:szCs w:val="32"/>
+        </w:rPr>
+        <w:t xml:space="preserve"> has JIT (Just in Time compiler)</w:t>
+      </w:r>
+      <w:r>
+        <w:rPr>
+          <w:sz w:val="32"/>
+          <w:szCs w:val="32"/>
+        </w:rPr>
+        <w:t xml:space="preserve"> that complies the code on the go like translating a language while speaking. Used</w:t>
+      </w:r>
+      <w:r>
+        <w:rPr>
+          <w:sz w:val="32"/>
+          <w:szCs w:val="32"/>
+        </w:rPr>
+        <w:t xml:space="preserve"> for hot reload and restart</w:t>
+      </w:r>
+    </w:p>
+    <w:p>
+      <w:pPr>
+        <w:jc w:val="both"/>
+        <w:rPr>
+          <w:sz w:val="32"/>
+          <w:szCs w:val="32"/>
+        </w:rPr>
+      </w:pPr>
+      <w:r>
+        <w:rPr>
+          <w:sz w:val="32"/>
+          <w:szCs w:val="32"/>
+        </w:rPr>
+        <w:t># A</w:t>
+      </w:r>
+      <w:r>
+        <w:rPr>
+          <w:sz w:val="32"/>
+          <w:szCs w:val="32"/>
+        </w:rPr>
+        <w:t>nd AOT (Ahead of Time compiler)</w:t>
+      </w:r>
+      <w:r>
+        <w:rPr>
+          <w:sz w:val="32"/>
+          <w:szCs w:val="32"/>
+        </w:rPr>
+        <w:t xml:space="preserve"> that compiles the whole codebase at once like translating the whole book before publishing it (faster at runtime). Used</w:t>
+      </w:r>
+      <w:r>
+        <w:rPr>
+          <w:sz w:val="32"/>
+          <w:szCs w:val="32"/>
+        </w:rPr>
+        <w:t xml:space="preserve"> for building release APKs and App Bundle</w:t>
+      </w:r>
+    </w:p>
+    <w:p>
+      <w:pPr>
+        <w:jc w:val="both"/>
+        <w:rPr>
+          <w:sz w:val="32"/>
+          <w:szCs w:val="32"/>
+        </w:rPr>
+      </w:pPr>
+    </w:p>
+    <w:p>
+      <w:pPr>
+        <w:jc w:val="both"/>
+        <w:rPr>
+          <w:sz w:val="32"/>
+          <w:szCs w:val="32"/>
+        </w:rPr>
+      </w:pPr>
+      <w:r>
+        <w:rPr>
+          <w:sz w:val="32"/>
+          <w:szCs w:val="32"/>
+        </w:rPr>
+        <w:lastRenderedPageBreak/>
+        <w:t>Isolate</w:t>
+      </w:r>
+      <w:r>
+        <w:rPr>
+          <w:sz w:val="32"/>
+          <w:szCs w:val="32"/>
+        </w:rPr>
+        <w:t xml:space="preserve"> and Event Loop</w:t>
+      </w:r>
+      <w:r>
+        <w:rPr>
+          <w:sz w:val="32"/>
+          <w:szCs w:val="32"/>
+        </w:rPr>
+        <w:t>:</w:t>
+      </w:r>
+    </w:p>
+    <w:p>
+      <w:pPr>
+        <w:jc w:val="both"/>
+        <w:rPr>
+          <w:sz w:val="32"/>
+          <w:szCs w:val="32"/>
+        </w:rPr>
+      </w:pPr>
+      <w:r>
+        <w:rPr>
+          <w:sz w:val="32"/>
+          <w:szCs w:val="32"/>
+        </w:rPr>
+        <w:t xml:space="preserve"># All </w:t>
+      </w:r>
+      <w:r>
+        <w:rPr>
+          <w:b/>
+          <w:bCs/>
+          <w:sz w:val="32"/>
+          <w:szCs w:val="32"/>
+        </w:rPr>
+        <w:t xml:space="preserve">Dart </w:t>
+      </w:r>
+      <w:r>
+        <w:rPr>
+          <w:sz w:val="32"/>
+          <w:szCs w:val="32"/>
+        </w:rPr>
+        <w:t>code runs inside of an Isolate which is like a chunk of memory running a single-threaded Event Loop.</w:t>
+      </w:r>
+    </w:p>
+    <w:p>
+      <w:pPr>
+        <w:jc w:val="both"/>
+        <w:rPr>
+          <w:sz w:val="32"/>
+          <w:szCs w:val="32"/>
+        </w:rPr>
+      </w:pPr>
+      <w:r>
+        <w:rPr>
+          <w:sz w:val="32"/>
+          <w:szCs w:val="32"/>
+        </w:rPr>
+        <w:t># This makes it possible to perform asynchronous background work on a single thread. But we can also spawn multiple Isolates to run code in parallel</w:t>
+      </w:r>
+    </w:p>
+    <w:p>
+      <w:pPr>
+        <w:jc w:val="both"/>
+        <w:rPr>
+          <w:sz w:val="32"/>
+          <w:szCs w:val="32"/>
+        </w:rPr>
+      </w:pPr>
+    </w:p>
+    <w:p>
+      <w:pPr>
+        <w:jc w:val="both"/>
+        <w:rPr>
+          <w:sz w:val="32"/>
+          <w:szCs w:val="32"/>
+        </w:rPr>
+      </w:pPr>
+      <w:r>
+        <w:rPr>
+          <w:sz w:val="32"/>
+          <w:szCs w:val="32"/>
+        </w:rPr>
+        <w:t>Functions and OOP in Dart:</w:t>
+      </w:r>
+    </w:p>
+    <w:p>
+      <w:pPr>
+        <w:jc w:val="both"/>
+        <w:rPr>
+          <w:sz w:val="32"/>
+          <w:szCs w:val="32"/>
+        </w:rPr>
+      </w:pPr>
+      <w:r>
+        <w:rPr>
+          <w:sz w:val="32"/>
+          <w:szCs w:val="32"/>
+        </w:rPr>
+        <w:t># Unlike C’s</w:t>
+      </w:r>
+      <w:r>
+        <w:rPr>
+          <w:b/>
+          <w:bCs/>
+          <w:sz w:val="32"/>
+          <w:szCs w:val="32"/>
+        </w:rPr>
+        <w:t xml:space="preserve"> </w:t>
+      </w:r>
+      <w:proofErr w:type="gramStart"/>
+      <w:r>
+        <w:rPr>
+          <w:b/>
+          <w:bCs/>
+          <w:sz w:val="32"/>
+          <w:szCs w:val="32"/>
+        </w:rPr>
+        <w:t>main(</w:t>
+      </w:r>
+      <w:proofErr w:type="gramEnd"/>
+      <w:r>
+        <w:rPr>
+          <w:b/>
+          <w:bCs/>
+          <w:sz w:val="32"/>
+          <w:szCs w:val="32"/>
+        </w:rPr>
+        <w:t>)</w:t>
+      </w:r>
+      <w:r>
+        <w:rPr>
+          <w:sz w:val="32"/>
+          <w:szCs w:val="32"/>
+        </w:rPr>
+        <w:t xml:space="preserve"> function, </w:t>
+      </w:r>
+      <w:r>
+        <w:rPr>
+          <w:b/>
+          <w:bCs/>
+          <w:sz w:val="32"/>
+          <w:szCs w:val="32"/>
+        </w:rPr>
+        <w:t>Dart</w:t>
+      </w:r>
+      <w:r>
+        <w:rPr>
+          <w:sz w:val="32"/>
+          <w:szCs w:val="32"/>
+        </w:rPr>
+        <w:t xml:space="preserve">’s </w:t>
+      </w:r>
+      <w:r>
+        <w:rPr>
+          <w:b/>
+          <w:bCs/>
+          <w:sz w:val="32"/>
+          <w:szCs w:val="32"/>
+        </w:rPr>
+        <w:t>main()</w:t>
+      </w:r>
+      <w:r>
+        <w:rPr>
+          <w:sz w:val="32"/>
+          <w:szCs w:val="32"/>
+        </w:rPr>
+        <w:t xml:space="preserve"> function has no return values so it’s always </w:t>
+      </w:r>
+      <w:r>
+        <w:rPr>
+          <w:b/>
+          <w:bCs/>
+          <w:sz w:val="32"/>
+          <w:szCs w:val="32"/>
+        </w:rPr>
+        <w:t>void</w:t>
+      </w:r>
+    </w:p>
+    <w:p>
+      <w:pPr>
+        <w:jc w:val="both"/>
+        <w:rPr>
+          <w:sz w:val="32"/>
+          <w:szCs w:val="32"/>
+        </w:rPr>
+      </w:pPr>
+      <w:r>
+        <w:rPr>
+          <w:sz w:val="32"/>
+          <w:szCs w:val="32"/>
+        </w:rPr>
+        <w:t xml:space="preserve"># Every value or anything we can store in a variable is an object in </w:t>
+      </w:r>
+      <w:r>
+        <w:rPr>
+          <w:b/>
+          <w:bCs/>
+          <w:sz w:val="32"/>
+          <w:szCs w:val="32"/>
+        </w:rPr>
+        <w:t>Dart</w:t>
+      </w:r>
+      <w:r>
+        <w:rPr>
+          <w:sz w:val="32"/>
+          <w:szCs w:val="32"/>
+        </w:rPr>
+        <w:t xml:space="preserve">, meaning except </w:t>
+      </w:r>
+      <w:r>
+        <w:rPr>
+          <w:b/>
+          <w:bCs/>
+          <w:sz w:val="32"/>
+          <w:szCs w:val="32"/>
+        </w:rPr>
+        <w:t>null</w:t>
+      </w:r>
+      <w:r>
+        <w:rPr>
+          <w:sz w:val="32"/>
+          <w:szCs w:val="32"/>
+        </w:rPr>
+        <w:t xml:space="preserve"> everything in</w:t>
+      </w:r>
+      <w:r>
+        <w:rPr>
+          <w:b/>
+          <w:bCs/>
+          <w:sz w:val="32"/>
+          <w:szCs w:val="32"/>
+        </w:rPr>
+        <w:t xml:space="preserve"> Dart</w:t>
+      </w:r>
+      <w:r>
+        <w:rPr>
+          <w:sz w:val="32"/>
+          <w:szCs w:val="32"/>
+        </w:rPr>
+        <w:t xml:space="preserve"> is an object</w:t>
+      </w:r>
+    </w:p>
+    <w:p>
+      <w:pPr>
+        <w:jc w:val="both"/>
+        <w:rPr>
+          <w:sz w:val="32"/>
+          <w:szCs w:val="32"/>
+        </w:rPr>
+      </w:pPr>
+      <w:r>
+        <w:rPr>
+          <w:sz w:val="32"/>
+          <w:szCs w:val="32"/>
+        </w:rPr>
+        <w:t># Functions are also first-class objects in</w:t>
+      </w:r>
+      <w:r>
+        <w:rPr>
+          <w:b/>
+          <w:bCs/>
+          <w:sz w:val="32"/>
+          <w:szCs w:val="32"/>
+        </w:rPr>
+        <w:t xml:space="preserve"> Dart </w:t>
+      </w:r>
+      <w:r>
+        <w:rPr>
+          <w:sz w:val="32"/>
+          <w:szCs w:val="32"/>
+        </w:rPr>
+        <w:t>which means they can be passed around for Functional Programming (</w:t>
+      </w:r>
+      <w:proofErr w:type="spellStart"/>
+      <w:r>
+        <w:rPr>
+          <w:b/>
+          <w:bCs/>
+          <w:sz w:val="32"/>
+          <w:szCs w:val="32"/>
+        </w:rPr>
+        <w:t>VoidCallback</w:t>
+      </w:r>
+      <w:proofErr w:type="spellEnd"/>
+      <w:r>
+        <w:rPr>
+          <w:sz w:val="32"/>
+          <w:szCs w:val="32"/>
+        </w:rPr>
+        <w:t xml:space="preserve">, </w:t>
+      </w:r>
+      <w:proofErr w:type="spellStart"/>
+      <w:r>
+        <w:rPr>
+          <w:b/>
+          <w:bCs/>
+          <w:sz w:val="32"/>
+          <w:szCs w:val="32"/>
+        </w:rPr>
+        <w:t>ValueChanged</w:t>
+      </w:r>
+      <w:proofErr w:type="spellEnd"/>
+      <w:r>
+        <w:rPr>
+          <w:sz w:val="32"/>
+          <w:szCs w:val="32"/>
+        </w:rPr>
+        <w:t>, and</w:t>
+      </w:r>
+      <w:r>
+        <w:rPr>
+          <w:b/>
+          <w:bCs/>
+          <w:sz w:val="32"/>
+          <w:szCs w:val="32"/>
+        </w:rPr>
+        <w:t xml:space="preserve"> lambda functions () =&gt;</w:t>
+      </w:r>
+      <w:r>
+        <w:rPr>
+          <w:sz w:val="32"/>
+          <w:szCs w:val="32"/>
+        </w:rPr>
+        <w:t>)</w:t>
+      </w:r>
+    </w:p>
+    <w:p>
+      <w:pPr>
+        <w:jc w:val="both"/>
+        <w:rPr>
+          <w:b/>
+          <w:bCs/>
+          <w:sz w:val="32"/>
+          <w:szCs w:val="32"/>
+        </w:rPr>
+      </w:pPr>
+    </w:p>
+    <w:p>
+      <w:pPr>
+        <w:jc w:val="center"/>
+        <w:rPr>
+          <w:sz w:val="32"/>
+          <w:szCs w:val="32"/>
+        </w:rPr>
+      </w:pPr>
+      <w:r>
+        <w:rPr>
+          <w:sz w:val="32"/>
+          <w:szCs w:val="32"/>
+        </w:rPr>
+        <w:t>Break</w:t>
+      </w:r>
+    </w:p>
+    <w:p>
+      <w:pPr>
+        <w:jc w:val="both"/>
+        <w:rPr>
+          <w:b/>
+          <w:bCs/>
+          <w:sz w:val="32"/>
+          <w:szCs w:val="32"/>
+        </w:rPr>
+      </w:pPr>
+    </w:p>
+    <w:p>
+      <w:pPr>
+        <w:jc w:val="both"/>
+        <w:rPr>
+          <w:b/>
+          <w:bCs/>
+          <w:sz w:val="32"/>
+          <w:szCs w:val="32"/>
+        </w:rPr>
+      </w:pPr>
       <w:proofErr w:type="gramStart"/>
       <w:r>
         <w:rPr>
@@ -344,6 +1096,7 @@
           <w:sz w:val="32"/>
           <w:szCs w:val="32"/>
         </w:rPr>
+        <w:lastRenderedPageBreak/>
         <w:t># Imagine this timeline:</w:t>
       </w:r>
     </w:p>
@@ -581,7 +1334,6 @@
           <w:sz w:val="32"/>
           <w:szCs w:val="32"/>
         </w:rPr>
-        <w:lastRenderedPageBreak/>
         <w:t xml:space="preserve"># </w:t>
       </w:r>
       <w:r>
@@ -928,6 +1680,7 @@
           <w:sz w:val="32"/>
           <w:szCs w:val="32"/>
         </w:rPr>
+        <w:lastRenderedPageBreak/>
         <w:t xml:space="preserve">        ↓</w:t>
       </w:r>
     </w:p>
@@ -1814,6 +2567,7 @@
           <w:sz w:val="32"/>
           <w:szCs w:val="32"/>
         </w:rPr>
+        <w:lastRenderedPageBreak/>
         <w:t xml:space="preserve">    })</w:t>
       </w:r>
     </w:p>
@@ -1979,7 +2733,6 @@
           <w:sz w:val="32"/>
           <w:szCs w:val="32"/>
         </w:rPr>
-        <w:lastRenderedPageBreak/>
         <w:t># Removes unnecessary packages and frees up disk space on developer machine. For more info see d5 dart new features documentation.</w:t>
       </w:r>
     </w:p>
@@ -2340,7 +3093,17 @@
                 <w:sz w:val="32"/>
                 <w:szCs w:val="32"/>
               </w:rPr>
-              <w:t>Safe because type is locked. Full compile-time checks.</w:t>
+              <w:t xml:space="preserve">Safe because type is locked. </w:t>
+            </w:r>
+            <w:r>
+              <w:rPr>
+                <w:b w:val="0"/>
+                <w:bCs w:val="0"/>
+                <w:sz w:val="32"/>
+                <w:szCs w:val="32"/>
+              </w:rPr>
+              <w:lastRenderedPageBreak/>
+              <w:t>Full compile-time checks.</w:t>
             </w:r>
           </w:p>
         </w:tc>
@@ -2369,6 +3132,7 @@
                 <w:sz w:val="32"/>
                 <w:szCs w:val="32"/>
               </w:rPr>
+              <w:lastRenderedPageBreak/>
               <w:t>var  y</w:t>
             </w:r>
             <w:proofErr w:type="gramEnd"/>
@@ -2562,6 +3326,7 @@
                 <w:sz w:val="32"/>
                 <w:szCs w:val="32"/>
               </w:rPr>
+              <w:lastRenderedPageBreak/>
               <w:t>Object  z</w:t>
             </w:r>
             <w:proofErr w:type="gramEnd"/>
@@ -2995,9 +3760,9 @@
     </w:lvl>
   </w:abstractNum>
   <w:abstractNum w:abstractNumId="1" w15:restartNumberingAfterBreak="0">
-    <w:nsid w:val="59612DBC"/>
+    <w:nsid w:val="55A01DC0"/>
     <w:multiLevelType w:val="hybridMultilevel"/>
-    <w:tmpl w:val="8C88D8AC"/>
+    <w:tmpl w:val="E82C902C"/>
     <w:lvl w:ilvl="0" w:tplc="04090001">
       <w:start w:val="1"/>
       <w:numFmt w:val="bullet"/>
@@ -3108,9 +3873,9 @@
     </w:lvl>
   </w:abstractNum>
   <w:abstractNum w:abstractNumId="2" w15:restartNumberingAfterBreak="0">
-    <w:nsid w:val="7C005978"/>
+    <w:nsid w:val="59612DBC"/>
     <w:multiLevelType w:val="hybridMultilevel"/>
-    <w:tmpl w:val="3D4E4A9C"/>
+    <w:tmpl w:val="8C88D8AC"/>
     <w:lvl w:ilvl="0" w:tplc="04090001">
       <w:start w:val="1"/>
       <w:numFmt w:val="bullet"/>
@@ -3220,13 +3985,129 @@
       </w:rPr>
     </w:lvl>
   </w:abstractNum>
+  <w:abstractNum w:abstractNumId="3" w15:restartNumberingAfterBreak="0">
+    <w:nsid w:val="7C005978"/>
+    <w:multiLevelType w:val="hybridMultilevel"/>
+    <w:tmpl w:val="3D4E4A9C"/>
+    <w:lvl w:ilvl="0" w:tplc="04090001">
+      <w:start w:val="1"/>
+      <w:numFmt w:val="bullet"/>
+      <w:lvlText w:val=""/>
+      <w:lvlJc w:val="left"/>
+      <w:pPr>
+        <w:ind w:left="360" w:hanging="360"/>
+      </w:pPr>
+      <w:rPr>
+        <w:rFonts w:ascii="Symbol" w:hAnsi="Symbol" w:hint="default"/>
+      </w:rPr>
+    </w:lvl>
+    <w:lvl w:ilvl="1" w:tplc="04090003" w:tentative="1">
+      <w:start w:val="1"/>
+      <w:numFmt w:val="bullet"/>
+      <w:lvlText w:val="o"/>
+      <w:lvlJc w:val="left"/>
+      <w:pPr>
+        <w:ind w:left="1080" w:hanging="360"/>
+      </w:pPr>
+      <w:rPr>
+        <w:rFonts w:ascii="Courier New" w:hAnsi="Courier New" w:cs="Courier New" w:hint="default"/>
+      </w:rPr>
+    </w:lvl>
+    <w:lvl w:ilvl="2" w:tplc="04090005" w:tentative="1">
+      <w:start w:val="1"/>
+      <w:numFmt w:val="bullet"/>
+      <w:lvlText w:val=""/>
+      <w:lvlJc w:val="left"/>
+      <w:pPr>
+        <w:ind w:left="1800" w:hanging="360"/>
+      </w:pPr>
+      <w:rPr>
+        <w:rFonts w:ascii="Wingdings" w:hAnsi="Wingdings" w:hint="default"/>
+      </w:rPr>
+    </w:lvl>
+    <w:lvl w:ilvl="3" w:tplc="04090001" w:tentative="1">
+      <w:start w:val="1"/>
+      <w:numFmt w:val="bullet"/>
+      <w:lvlText w:val=""/>
+      <w:lvlJc w:val="left"/>
+      <w:pPr>
+        <w:ind w:left="2520" w:hanging="360"/>
+      </w:pPr>
+      <w:rPr>
+        <w:rFonts w:ascii="Symbol" w:hAnsi="Symbol" w:hint="default"/>
+      </w:rPr>
+    </w:lvl>
+    <w:lvl w:ilvl="4" w:tplc="04090003" w:tentative="1">
+      <w:start w:val="1"/>
+      <w:numFmt w:val="bullet"/>
+      <w:lvlText w:val="o"/>
+      <w:lvlJc w:val="left"/>
+      <w:pPr>
+        <w:ind w:left="3240" w:hanging="360"/>
+      </w:pPr>
+      <w:rPr>
+        <w:rFonts w:ascii="Courier New" w:hAnsi="Courier New" w:cs="Courier New" w:hint="default"/>
+      </w:rPr>
+    </w:lvl>
+    <w:lvl w:ilvl="5" w:tplc="04090005" w:tentative="1">
+      <w:start w:val="1"/>
+      <w:numFmt w:val="bullet"/>
+      <w:lvlText w:val=""/>
+      <w:lvlJc w:val="left"/>
+      <w:pPr>
+        <w:ind w:left="3960" w:hanging="360"/>
+      </w:pPr>
+      <w:rPr>
+        <w:rFonts w:ascii="Wingdings" w:hAnsi="Wingdings" w:hint="default"/>
+      </w:rPr>
+    </w:lvl>
+    <w:lvl w:ilvl="6" w:tplc="04090001" w:tentative="1">
+      <w:start w:val="1"/>
+      <w:numFmt w:val="bullet"/>
+      <w:lvlText w:val=""/>
+      <w:lvlJc w:val="left"/>
+      <w:pPr>
+        <w:ind w:left="4680" w:hanging="360"/>
+      </w:pPr>
+      <w:rPr>
+        <w:rFonts w:ascii="Symbol" w:hAnsi="Symbol" w:hint="default"/>
+      </w:rPr>
+    </w:lvl>
+    <w:lvl w:ilvl="7" w:tplc="04090003" w:tentative="1">
+      <w:start w:val="1"/>
+      <w:numFmt w:val="bullet"/>
+      <w:lvlText w:val="o"/>
+      <w:lvlJc w:val="left"/>
+      <w:pPr>
+        <w:ind w:left="5400" w:hanging="360"/>
+      </w:pPr>
+      <w:rPr>
+        <w:rFonts w:ascii="Courier New" w:hAnsi="Courier New" w:cs="Courier New" w:hint="default"/>
+      </w:rPr>
+    </w:lvl>
+    <w:lvl w:ilvl="8" w:tplc="04090005" w:tentative="1">
+      <w:start w:val="1"/>
+      <w:numFmt w:val="bullet"/>
+      <w:lvlText w:val=""/>
+      <w:lvlJc w:val="left"/>
+      <w:pPr>
+        <w:ind w:left="6120" w:hanging="360"/>
+      </w:pPr>
+      <w:rPr>
+        <w:rFonts w:ascii="Wingdings" w:hAnsi="Wingdings" w:hint="default"/>
+      </w:rPr>
+    </w:lvl>
+  </w:abstractNum>
   <w:num w:numId="1" w16cid:durableId="823931229">
-    <w:abstractNumId w:val="2"/>
+    <w:abstractNumId w:val="3"/>
   </w:num>
   <w:num w:numId="2" w16cid:durableId="1315328939">
     <w:abstractNumId w:val="0"/>
   </w:num>
   <w:num w:numId="3" w16cid:durableId="2141147586">
+    <w:abstractNumId w:val="2"/>
+  </w:num>
+  <w:num w:numId="4" w16cid:durableId="1738937060">
     <w:abstractNumId w:val="1"/>
   </w:num>
 </w:numbering>
@@ -3835,6 +4716,7 @@
   <w:style w:type="character" w:default="1" w:styleId="DefaultParagraphFont">
     <w:name w:val="Default Paragraph Font"/>
     <w:uiPriority w:val="1"/>
+    <w:semiHidden/>
     <w:unhideWhenUsed/>
   </w:style>
   <w:style w:type="table" w:default="1" w:styleId="TableNormal">

</xml_diff>